<commit_message>
Add session login and role tables on MySQL
</commit_message>
<xml_diff>
--- a/Rakshit Builders - Inventory & Store Management System .docx
+++ b/Rakshit Builders - Inventory & Store Management System .docx
@@ -1,6 +1,6 @@
 
 <file path=word/document.xml><?xml version="1.0" encoding="utf-8"?>
-<w:document xmlns:wpc="http://schemas.microsoft.com/office/word/2010/wordprocessingCanvas" xmlns:cx="http://schemas.microsoft.com/office/drawing/2014/chartex" xmlns:cx1="http://schemas.microsoft.com/office/drawing/2015/9/8/chartex" xmlns:cx2="http://schemas.microsoft.com/office/drawing/2015/10/21/chartex" xmlns:cx3="http://schemas.microsoft.com/office/drawing/2016/5/9/chartex" xmlns:cx4="http://schemas.microsoft.com/office/drawing/2016/5/10/chartex" xmlns:cx5="http://schemas.microsoft.com/office/drawing/2016/5/11/chartex" xmlns:cx6="http://schemas.microsoft.com/office/drawing/2016/5/12/chartex" xmlns:cx7="http://schemas.microsoft.com/office/drawing/2016/5/13/chartex" xmlns:cx8="http://schemas.microsoft.com/office/drawing/2016/5/14/chartex" xmlns:mc="http://schemas.openxmlformats.org/markup-compatibility/2006" xmlns:aink="http://schemas.microsoft.com/office/drawing/2016/ink" xmlns:am3d="http://schemas.microsoft.com/office/drawing/2017/model3d" xmlns:o="urn:schemas-microsoft-com:office:office" xmlns:oel="http://schemas.microsoft.com/office/2019/extlst" xmlns:r="http://schemas.openxmlformats.org/officeDocument/2006/relationships" xmlns:m="http://schemas.openxmlformats.org/officeDocument/2006/math" xmlns:v="urn:schemas-microsoft-com:vml" xmlns:wp14="http://schemas.microsoft.com/office/word/2010/wordprocessingDrawing" xmlns:wp="http://schemas.openxmlformats.org/drawingml/2006/wordprocessingDrawing" xmlns:w10="urn:schemas-microsoft-com:office:word" xmlns:w="http://schemas.openxmlformats.org/wordprocessingml/2006/main" xmlns:w14="http://schemas.microsoft.com/office/word/2010/wordml" xmlns:w15="http://schemas.microsoft.com/office/word/2012/wordml" xmlns:w16cex="http://schemas.microsoft.com/office/word/2018/wordml/cex" xmlns:w16cid="http://schemas.microsoft.com/office/word/2016/wordml/cid" xmlns:w16="http://schemas.microsoft.com/office/word/2018/wordml" xmlns:w16du="http://schemas.microsoft.com/office/word/2023/wordml/word16du" xmlns:w16sdtdh="http://schemas.microsoft.com/office/word/2020/wordml/sdtdatahash" xmlns:w16sdtfl="http://schemas.microsoft.com/office/word/2024/wordml/sdtformatlock" xmlns:w16se="http://schemas.microsoft.com/office/word/2015/wordml/symex" xmlns:wpg="http://schemas.microsoft.com/office/word/2010/wordprocessingGroup" xmlns:wpi="http://schemas.microsoft.com/office/word/2010/wordprocessingInk" xmlns:wne="http://schemas.microsoft.com/office/word/2006/wordml" xmlns:wps="http://schemas.microsoft.com/office/word/2010/wordprocessingShape" mc:Ignorable="w14 w15 w16se w16cid w16 w16cex w16sdtdh w16sdtfl w16du wp14">
+<w:document xmlns:ve="http://schemas.openxmlformats.org/markup-compatibility/2006" xmlns:o="urn:schemas-microsoft-com:office:office" xmlns:r="http://schemas.openxmlformats.org/officeDocument/2006/relationships" xmlns:m="http://schemas.openxmlformats.org/officeDocument/2006/math" xmlns:v="urn:schemas-microsoft-com:vml" xmlns:wp="http://schemas.openxmlformats.org/drawingml/2006/wordprocessingDrawing" xmlns:w10="urn:schemas-microsoft-com:office:word" xmlns:w="http://schemas.openxmlformats.org/wordprocessingml/2006/main" xmlns:wne="http://schemas.microsoft.com/office/word/2006/wordml">
   <w:body>
     <w:p>
       <w:pPr>
@@ -81,27 +81,24 @@
     </w:p>
     <w:p>
       <w:r>
-        <w:t>Frontend: React + TypeScript</w:t>
-      </w:r>
-    </w:p>
-    <w:p>
-      <w:r>
-        <w:t>UI: Tailwind CSS</w:t>
-      </w:r>
-    </w:p>
-    <w:p>
-      <w:r>
-        <w:t>State/Data: React Query</w:t>
-      </w:r>
-    </w:p>
-    <w:p>
-      <w:r>
-        <w:t>Backend: Laravel REST API</w:t>
-      </w:r>
-    </w:p>
-    <w:p>
-      <w:r>
-        <w:t>Authentication: Laravel Sanctum</w:t>
+        <w:t xml:space="preserve">Dashboard </w:t>
+      </w:r>
+      <w:r>
+        <w:t xml:space="preserve">: </w:t>
+      </w:r>
+      <w:r>
+        <w:t>Laravel</w:t>
+      </w:r>
+    </w:p>
+    <w:p>
+      <w:r>
+        <w:t xml:space="preserve">UI: </w:t>
+      </w:r>
+      <w:r>
+        <w:t>Simple</w:t>
+      </w:r>
+      <w:r>
+        <w:t xml:space="preserve"> CSS</w:t>
       </w:r>
     </w:p>
     <w:p>
@@ -111,7 +108,10 @@
     </w:p>
     <w:p>
       <w:r>
-        <w:t>Storage: Local/S3-compatible, depending on deployment</w:t>
+        <w:t xml:space="preserve">Storage: </w:t>
+      </w:r>
+      <w:r>
+        <w:t>Local/S3-compatible, depending on deployment</w:t>
       </w:r>
     </w:p>
     <w:p>
@@ -126,7 +126,7 @@
     </w:p>
     <w:p>
       <w:r>
-        <w:pict w14:anchorId="77AF3D9E">
+        <w:pict>
           <v:rect id="_x0000_i1025" style="width:0;height:1.5pt" o:hralign="center" o:hrstd="t" o:hr="t" fillcolor="#a0a0a0" stroked="f"/>
         </w:pict>
       </w:r>
@@ -158,7 +158,7 @@
     </w:p>
     <w:p>
       <w:r>
-        <w:t>React Frontend</w:t>
+        <w:t>Laravel Dashboard</w:t>
       </w:r>
     </w:p>
     <w:p>
@@ -168,7 +168,55 @@
     </w:p>
     <w:p>
       <w:r>
-        <w:t xml:space="preserve">      │ REST API</w:t>
+        <w:t xml:space="preserve">      ├── Authentication</w:t>
+      </w:r>
+    </w:p>
+    <w:p>
+      <w:r>
+        <w:t xml:space="preserve">      </w:t>
+      </w:r>
+      <w:r>
+        <w:t>├── Authorization</w:t>
+      </w:r>
+    </w:p>
+    <w:p>
+      <w:r>
+        <w:t xml:space="preserve">      ├── Products</w:t>
+      </w:r>
+    </w:p>
+    <w:p>
+      <w:r>
+        <w:t xml:space="preserve">      ├── Inventory</w:t>
+      </w:r>
+    </w:p>
+    <w:p>
+      <w:r>
+        <w:t xml:space="preserve">      ├── Purchases</w:t>
+      </w:r>
+    </w:p>
+    <w:p>
+      <w:r>
+        <w:t xml:space="preserve">      ├── Suppliers</w:t>
+      </w:r>
+    </w:p>
+    <w:p>
+      <w:r>
+        <w:t xml:space="preserve">      ├── Dispatch</w:t>
+      </w:r>
+    </w:p>
+    <w:p>
+      <w:r>
+        <w:t xml:space="preserve">      ├── Reports</w:t>
+      </w:r>
+    </w:p>
+    <w:p>
+      <w:r>
+        <w:t xml:space="preserve">      └── Activity Logs</w:t>
+      </w:r>
+    </w:p>
+    <w:p>
+      <w:r>
+        <w:t xml:space="preserve">      │</w:t>
       </w:r>
     </w:p>
     <w:p>
@@ -178,77 +226,12 @@
     </w:p>
     <w:p>
       <w:r>
-        <w:t>Laravel Backend</w:t>
-      </w:r>
-    </w:p>
-    <w:p>
-      <w:r>
-        <w:t xml:space="preserve">      │</w:t>
-      </w:r>
-    </w:p>
-    <w:p>
-      <w:r>
-        <w:t xml:space="preserve">      ├── Authentication</w:t>
-      </w:r>
-    </w:p>
-    <w:p>
-      <w:r>
-        <w:t xml:space="preserve">      ├── Authorization</w:t>
-      </w:r>
-    </w:p>
-    <w:p>
-      <w:r>
-        <w:t xml:space="preserve">      ├── Products</w:t>
-      </w:r>
-    </w:p>
-    <w:p>
-      <w:r>
-        <w:t xml:space="preserve">      ├── Inventory</w:t>
-      </w:r>
-    </w:p>
-    <w:p>
-      <w:r>
-        <w:t xml:space="preserve">      ├── Purchases</w:t>
-      </w:r>
-    </w:p>
-    <w:p>
-      <w:r>
-        <w:t xml:space="preserve">      ├── Suppliers</w:t>
-      </w:r>
-    </w:p>
-    <w:p>
-      <w:r>
-        <w:t xml:space="preserve">      ├── Dispatch</w:t>
-      </w:r>
-    </w:p>
-    <w:p>
-      <w:r>
-        <w:t xml:space="preserve">      ├── Reports</w:t>
-      </w:r>
-    </w:p>
-    <w:p>
-      <w:r>
-        <w:t xml:space="preserve">      └── Activity Logs</w:t>
-      </w:r>
-    </w:p>
-    <w:p>
-      <w:r>
-        <w:t xml:space="preserve">      │</w:t>
-      </w:r>
-    </w:p>
-    <w:p>
-      <w:r>
-        <w:t xml:space="preserve">      ▼</w:t>
-      </w:r>
-    </w:p>
-    <w:p>
-      <w:r>
         <w:t>MySQL</w:t>
       </w:r>
     </w:p>
     <w:p>
       <w:r>
-        <w:pict w14:anchorId="37E61380">
+        <w:pict>
           <v:rect id="_x0000_i1026" style="width:0;height:1.5pt" o:hralign="center" o:hrstd="t" o:hr="t" fillcolor="#a0a0a0" stroked="f"/>
         </w:pict>
       </w:r>
@@ -291,7 +274,6 @@
           <w:sz w:val="46"/>
           <w:szCs w:val="46"/>
         </w:rPr>
-        <w:lastRenderedPageBreak/>
         <w:t>2. Roles &amp; Permissions</w:t>
       </w:r>
     </w:p>
@@ -340,7 +322,11 @@
         <w:spacing w:before="240" w:after="240"/>
       </w:pPr>
       <w:r>
-        <w:t>Full access.</w:t>
+        <w:lastRenderedPageBreak/>
+        <w:t xml:space="preserve">Full </w:t>
+      </w:r>
+      <w:r>
+        <w:t>access.</w:t>
       </w:r>
     </w:p>
     <w:p>
@@ -505,7 +491,7 @@
         <w:spacing w:before="240" w:after="240"/>
       </w:pPr>
       <w:r>
-        <w:t>Do not rely on frontend hiding alone.</w:t>
+        <w:t>Do not rely on hiding links alone.</w:t>
       </w:r>
     </w:p>
     <w:p>
@@ -526,7 +512,7 @@
     </w:p>
     <w:p>
       <w:r>
-        <w:pict w14:anchorId="3632F84A">
+        <w:pict>
           <v:rect id="_x0000_i1027" style="width:0;height:1.5pt" o:hralign="center" o:hrstd="t" o:hr="t" fillcolor="#a0a0a0" stroked="f"/>
         </w:pict>
       </w:r>
@@ -566,119 +552,119 @@
     </w:p>
     <w:p>
       <w:r>
+        <w:t>users</w:t>
+      </w:r>
+    </w:p>
+    <w:p>
+      <w:r>
+        <w:t>roles</w:t>
+      </w:r>
+    </w:p>
+    <w:p>
+      <w:r>
+        <w:t>permissions</w:t>
+      </w:r>
+    </w:p>
+    <w:p>
+      <w:r>
+        <w:t>role_permissions</w:t>
+      </w:r>
+    </w:p>
+    <w:p/>
+    <w:p>
+      <w:r>
+        <w:t>categories</w:t>
+      </w:r>
+    </w:p>
+    <w:p>
+      <w:r>
+        <w:t>subcategories</w:t>
+      </w:r>
+    </w:p>
+    <w:p>
+      <w:r>
+        <w:t>brands</w:t>
+      </w:r>
+    </w:p>
+    <w:p>
+      <w:r>
+        <w:t>units</w:t>
+      </w:r>
+    </w:p>
+    <w:p>
+      <w:r>
         <w:lastRenderedPageBreak/>
-        <w:t>users</w:t>
-      </w:r>
-    </w:p>
-    <w:p>
-      <w:r>
-        <w:t>roles</w:t>
-      </w:r>
-    </w:p>
-    <w:p>
-      <w:r>
-        <w:t>permissions</w:t>
-      </w:r>
-    </w:p>
-    <w:p>
-      <w:r>
-        <w:t>role_permissions</w:t>
+        <w:t>products</w:t>
+      </w:r>
+    </w:p>
+    <w:p>
+      <w:r>
+        <w:t>product_images</w:t>
       </w:r>
     </w:p>
     <w:p/>
     <w:p>
       <w:r>
-        <w:t>categories</w:t>
-      </w:r>
-    </w:p>
-    <w:p>
-      <w:r>
-        <w:t>subcategories</w:t>
-      </w:r>
-    </w:p>
-    <w:p>
-      <w:r>
-        <w:t>brands</w:t>
-      </w:r>
-    </w:p>
-    <w:p>
-      <w:r>
-        <w:t>units</w:t>
-      </w:r>
-    </w:p>
-    <w:p>
-      <w:r>
-        <w:t>products</w:t>
-      </w:r>
-    </w:p>
-    <w:p>
-      <w:r>
-        <w:t>product_images</w:t>
+        <w:t>suppliers</w:t>
       </w:r>
     </w:p>
     <w:p/>
     <w:p>
       <w:r>
-        <w:t>suppliers</w:t>
+        <w:t>purchases</w:t>
+      </w:r>
+    </w:p>
+    <w:p>
+      <w:r>
+        <w:t>purchase_items</w:t>
       </w:r>
     </w:p>
     <w:p/>
     <w:p>
       <w:r>
-        <w:t>purchases</w:t>
-      </w:r>
-    </w:p>
-    <w:p>
-      <w:r>
-        <w:t>purchase_items</w:t>
+        <w:t>inventory</w:t>
+      </w:r>
+    </w:p>
+    <w:p>
+      <w:r>
+        <w:t>stock_movements</w:t>
+      </w:r>
+    </w:p>
+    <w:p>
+      <w:r>
+        <w:t>stock_adjustments</w:t>
       </w:r>
     </w:p>
     <w:p/>
     <w:p>
       <w:r>
-        <w:t>inventory</w:t>
-      </w:r>
-    </w:p>
-    <w:p>
-      <w:r>
-        <w:t>stock_movements</w:t>
-      </w:r>
-    </w:p>
-    <w:p>
-      <w:r>
-        <w:t>stock_adjustments</w:t>
+        <w:t>dispatches</w:t>
+      </w:r>
+    </w:p>
+    <w:p>
+      <w:r>
+        <w:t>dispatch_items</w:t>
+      </w:r>
+    </w:p>
+    <w:p>
+      <w:r>
+        <w:t>dispatch_assignments</w:t>
+      </w:r>
+    </w:p>
+    <w:p>
+      <w:r>
+        <w:t>dispatch_status_history</w:t>
       </w:r>
     </w:p>
     <w:p/>
     <w:p>
       <w:r>
-        <w:t>dispatches</w:t>
-      </w:r>
-    </w:p>
-    <w:p>
-      <w:r>
-        <w:t>dispatch_items</w:t>
-      </w:r>
-    </w:p>
-    <w:p>
-      <w:r>
-        <w:t>dispatch_assignments</w:t>
-      </w:r>
-    </w:p>
-    <w:p>
-      <w:r>
-        <w:t>dispatch_status_history</w:t>
+        <w:t>activity_logs</w:t>
       </w:r>
     </w:p>
     <w:p/>
     <w:p>
       <w:r>
-        <w:t>activity_logs</w:t>
-      </w:r>
-    </w:p>
-    <w:p/>
-    <w:p>
-      <w:r>
         <w:t>settings</w:t>
       </w:r>
     </w:p>
@@ -740,7 +726,7 @@
     </w:p>
     <w:p>
       <w:r>
-        <w:pict w14:anchorId="09A8BB50">
+        <w:pict>
           <v:rect id="_x0000_i1028" style="width:0;height:1.5pt" o:hralign="center" o:hrstd="t" o:hr="t" fillcolor="#a0a0a0" stroked="f"/>
         </w:pict>
       </w:r>
@@ -775,47 +761,47 @@
         <w:spacing w:before="240" w:after="240"/>
       </w:pPr>
       <w:r>
+        <w:t>Every product should have:</w:t>
+      </w:r>
+    </w:p>
+    <w:p>
+      <w:r>
+        <w:t>id</w:t>
+      </w:r>
+    </w:p>
+    <w:p>
+      <w:r>
+        <w:t>sku</w:t>
+      </w:r>
+    </w:p>
+    <w:p>
+      <w:r>
+        <w:t>barcode</w:t>
+      </w:r>
+    </w:p>
+    <w:p>
+      <w:r>
+        <w:t>name</w:t>
+      </w:r>
+    </w:p>
+    <w:p>
+      <w:r>
+        <w:t>category_id</w:t>
+      </w:r>
+    </w:p>
+    <w:p>
+      <w:r>
+        <w:t>subcategory_id</w:t>
+      </w:r>
+    </w:p>
+    <w:p>
+      <w:r>
+        <w:t>brand_id</w:t>
+      </w:r>
+    </w:p>
+    <w:p>
+      <w:r>
         <w:lastRenderedPageBreak/>
-        <w:t>Every product should have:</w:t>
-      </w:r>
-    </w:p>
-    <w:p>
-      <w:r>
-        <w:t>id</w:t>
-      </w:r>
-    </w:p>
-    <w:p>
-      <w:r>
-        <w:t>sku</w:t>
-      </w:r>
-    </w:p>
-    <w:p>
-      <w:r>
-        <w:t>barcode</w:t>
-      </w:r>
-    </w:p>
-    <w:p>
-      <w:r>
-        <w:t>name</w:t>
-      </w:r>
-    </w:p>
-    <w:p>
-      <w:r>
-        <w:t>category_id</w:t>
-      </w:r>
-    </w:p>
-    <w:p>
-      <w:r>
-        <w:t>subcategory_id</w:t>
-      </w:r>
-    </w:p>
-    <w:p>
-      <w:r>
-        <w:t>brand_id</w:t>
-      </w:r>
-    </w:p>
-    <w:p>
-      <w:r>
         <w:t>unit_id</w:t>
       </w:r>
     </w:p>
@@ -888,12 +874,15 @@
         <w:spacing w:before="240" w:after="240"/>
       </w:pPr>
       <w:r>
-        <w:t>It should be derived/maintained through inventory transactions.</w:t>
-      </w:r>
-    </w:p>
-    <w:p>
-      <w:r>
-        <w:pict w14:anchorId="2F09FCAF">
+        <w:t xml:space="preserve">It should be derived/maintained </w:t>
+      </w:r>
+      <w:r>
+        <w:t>through inventory transactions.</w:t>
+      </w:r>
+    </w:p>
+    <w:p>
+      <w:r>
+        <w:pict>
           <v:rect id="_x0000_i1029" style="width:0;height:1.5pt" o:hralign="center" o:hrstd="t" o:hr="t" fillcolor="#a0a0a0" stroked="f"/>
         </w:pict>
       </w:r>
@@ -1032,7 +1021,10 @@
         <w:spacing w:before="240" w:after="240"/>
       </w:pPr>
       <w:r>
-        <w:t xml:space="preserve">Every transaction must generate a </w:t>
+        <w:t>Every transaction m</w:t>
+      </w:r>
+      <w:r>
+        <w:t xml:space="preserve">ust generate a </w:t>
       </w:r>
       <w:r>
         <w:rPr>
@@ -1065,56 +1057,56 @@
     </w:p>
     <w:p>
       <w:r>
+        <w:t>quantity</w:t>
+      </w:r>
+    </w:p>
+    <w:p>
+      <w:r>
+        <w:t>previous_quantity</w:t>
+      </w:r>
+    </w:p>
+    <w:p>
+      <w:r>
+        <w:t>new_quantity</w:t>
+      </w:r>
+    </w:p>
+    <w:p>
+      <w:r>
+        <w:t>reference_type</w:t>
+      </w:r>
+    </w:p>
+    <w:p>
+      <w:r>
+        <w:t>reference_id</w:t>
+      </w:r>
+    </w:p>
+    <w:p>
+      <w:r>
+        <w:t>user_id</w:t>
+      </w:r>
+    </w:p>
+    <w:p>
+      <w:r>
+        <w:t>reason</w:t>
+      </w:r>
+    </w:p>
+    <w:p>
+      <w:r>
+        <w:t>created_at</w:t>
+      </w:r>
+    </w:p>
+    <w:p>
+      <w:pPr>
+        <w:spacing w:before="240" w:after="240"/>
+      </w:pPr>
+      <w:r>
         <w:lastRenderedPageBreak/>
-        <w:t>quantity</w:t>
-      </w:r>
-    </w:p>
-    <w:p>
-      <w:r>
-        <w:t>previous_quantity</w:t>
-      </w:r>
-    </w:p>
-    <w:p>
-      <w:r>
-        <w:t>new_quantity</w:t>
-      </w:r>
-    </w:p>
-    <w:p>
-      <w:r>
-        <w:t>reference_type</w:t>
-      </w:r>
-    </w:p>
-    <w:p>
-      <w:r>
-        <w:t>reference_id</w:t>
-      </w:r>
-    </w:p>
-    <w:p>
-      <w:r>
-        <w:t>user_id</w:t>
-      </w:r>
-    </w:p>
-    <w:p>
-      <w:r>
-        <w:t>reason</w:t>
-      </w:r>
-    </w:p>
-    <w:p>
-      <w:r>
-        <w:t>created_at</w:t>
-      </w:r>
-    </w:p>
-    <w:p>
-      <w:pPr>
-        <w:spacing w:before="240" w:after="240"/>
-      </w:pPr>
-      <w:r>
         <w:t>This is extremely important for auditability.</w:t>
       </w:r>
     </w:p>
     <w:p>
       <w:r>
-        <w:pict w14:anchorId="642465EB">
+        <w:pict>
           <v:rect id="_x0000_i1030" style="width:0;height:1.5pt" o:hralign="center" o:hrstd="t" o:hr="t" fillcolor="#a0a0a0" stroked="f"/>
         </w:pict>
       </w:r>
@@ -1149,7 +1141,10 @@
         <w:spacing w:before="240" w:after="240"/>
       </w:pPr>
       <w:r>
-        <w:t>Dispatch should have its own entity.</w:t>
+        <w:t xml:space="preserve">Dispatch should have its </w:t>
+      </w:r>
+      <w:r>
+        <w:t>own entity.</w:t>
       </w:r>
     </w:p>
     <w:p>
@@ -1328,7 +1323,7 @@
     </w:p>
     <w:p>
       <w:r>
-        <w:pict w14:anchorId="2DBF0E05">
+        <w:pict>
           <v:rect id="_x0000_i1031" style="width:0;height:1.5pt" o:hralign="center" o:hrstd="t" o:hr="t" fillcolor="#a0a0a0" stroked="f"/>
         </w:pict>
       </w:r>
@@ -1355,8 +1350,73 @@
           <w:sz w:val="46"/>
           <w:szCs w:val="46"/>
         </w:rPr>
+        <w:t>7. Dispatch State Machine</w:t>
+      </w:r>
+    </w:p>
+    <w:p>
+      <w:pPr>
+        <w:spacing w:before="240" w:after="240"/>
+      </w:pPr>
+      <w:r>
+        <w:t>Implement controlled transitions.</w:t>
+      </w:r>
+    </w:p>
+    <w:p>
+      <w:r>
+        <w:t>PENDING</w:t>
+      </w:r>
+    </w:p>
+    <w:p>
+      <w:r>
+        <w:rPr>
+          <w:rFonts w:ascii="Arial Unicode MS" w:eastAsia="Arial Unicode MS" w:hAnsi="Arial Unicode MS" w:cs="Arial Unicode MS"/>
+        </w:rPr>
+        <w:t xml:space="preserve">   ↓</w:t>
+      </w:r>
+    </w:p>
+    <w:p>
+      <w:r>
         <w:lastRenderedPageBreak/>
-        <w:t>7. Dispatch State Machine</w:t>
+        <w:t>PICKING</w:t>
+      </w:r>
+    </w:p>
+    <w:p>
+      <w:r>
+        <w:rPr>
+          <w:rFonts w:ascii="Arial Unicode MS" w:eastAsia="Arial Unicode MS" w:hAnsi="Arial Unicode MS" w:cs="Arial Unicode MS"/>
+        </w:rPr>
+        <w:t xml:space="preserve">   ↓</w:t>
+      </w:r>
+    </w:p>
+    <w:p>
+      <w:r>
+        <w:t>PACKING</w:t>
+      </w:r>
+    </w:p>
+    <w:p>
+      <w:r>
+        <w:rPr>
+          <w:rFonts w:ascii="Arial Unicode MS" w:eastAsia="Arial Unicode MS" w:hAnsi="Arial Unicode MS" w:cs="Arial Unicode MS"/>
+        </w:rPr>
+        <w:t xml:space="preserve">   ↓</w:t>
+      </w:r>
+    </w:p>
+    <w:p>
+      <w:r>
+        <w:t>READY</w:t>
+      </w:r>
+    </w:p>
+    <w:p>
+      <w:r>
+        <w:rPr>
+          <w:rFonts w:ascii="Arial Unicode MS" w:eastAsia="Arial Unicode MS" w:hAnsi="Arial Unicode MS" w:cs="Arial Unicode MS"/>
+        </w:rPr>
+        <w:t xml:space="preserve">   ↓</w:t>
+      </w:r>
+    </w:p>
+    <w:p>
+      <w:r>
+        <w:t>DISPATCHED</w:t>
       </w:r>
     </w:p>
     <w:p>
@@ -1364,12 +1424,12 @@
         <w:spacing w:before="240" w:after="240"/>
       </w:pPr>
       <w:r>
-        <w:t>Implement controlled transitions.</w:t>
-      </w:r>
-    </w:p>
-    <w:p>
-      <w:r>
-        <w:t>PENDING</w:t>
+        <w:t>Exception:</w:t>
+      </w:r>
+    </w:p>
+    <w:p>
+      <w:r>
+        <w:t>PICKING/PACKING</w:t>
       </w:r>
     </w:p>
     <w:p>
@@ -1377,12 +1437,31 @@
         <w:rPr>
           <w:rFonts w:ascii="Arial Unicode MS" w:eastAsia="Arial Unicode MS" w:hAnsi="Arial Unicode MS" w:cs="Arial Unicode MS"/>
         </w:rPr>
-        <w:t xml:space="preserve">   ↓</w:t>
-      </w:r>
-    </w:p>
-    <w:p>
-      <w:r>
-        <w:t>PICKING</w:t>
+        <w:t xml:space="preserve">      ↓</w:t>
+      </w:r>
+    </w:p>
+    <w:p>
+      <w:r>
+        <w:t xml:space="preserve">    ISSUE</w:t>
+      </w:r>
+    </w:p>
+    <w:p>
+      <w:pPr>
+        <w:spacing w:before="240" w:after="240"/>
+      </w:pPr>
+      <w:r>
+        <w:t>Do not allow arbitrary status</w:t>
+      </w:r>
+      <w:r>
+        <w:t xml:space="preserve"> changes.</w:t>
+      </w:r>
+    </w:p>
+    <w:p>
+      <w:pPr>
+        <w:spacing w:before="240" w:after="240"/>
+      </w:pPr>
+      <w:r>
+        <w:t>For example, a Loader should not be able to directly change:</w:t>
       </w:r>
     </w:p>
     <w:p>
@@ -1390,93 +1469,12 @@
         <w:rPr>
           <w:rFonts w:ascii="Arial Unicode MS" w:eastAsia="Arial Unicode MS" w:hAnsi="Arial Unicode MS" w:cs="Arial Unicode MS"/>
         </w:rPr>
-        <w:t xml:space="preserve">   ↓</w:t>
-      </w:r>
-    </w:p>
-    <w:p>
-      <w:r>
-        <w:t>PACKING</w:t>
-      </w:r>
-    </w:p>
-    <w:p>
-      <w:r>
-        <w:rPr>
-          <w:rFonts w:ascii="Arial Unicode MS" w:eastAsia="Arial Unicode MS" w:hAnsi="Arial Unicode MS" w:cs="Arial Unicode MS"/>
-        </w:rPr>
-        <w:t xml:space="preserve">   ↓</w:t>
-      </w:r>
-    </w:p>
-    <w:p>
-      <w:r>
-        <w:t>READY</w:t>
-      </w:r>
-    </w:p>
-    <w:p>
-      <w:r>
-        <w:rPr>
-          <w:rFonts w:ascii="Arial Unicode MS" w:eastAsia="Arial Unicode MS" w:hAnsi="Arial Unicode MS" w:cs="Arial Unicode MS"/>
-        </w:rPr>
-        <w:t xml:space="preserve">   ↓</w:t>
-      </w:r>
-    </w:p>
-    <w:p>
-      <w:r>
-        <w:t>DISPATCHED</w:t>
-      </w:r>
-    </w:p>
-    <w:p>
-      <w:pPr>
-        <w:spacing w:before="240" w:after="240"/>
-      </w:pPr>
-      <w:r>
-        <w:t>Exception:</w:t>
-      </w:r>
-    </w:p>
-    <w:p>
-      <w:r>
-        <w:t>PICKING/PACKING</w:t>
-      </w:r>
-    </w:p>
-    <w:p>
-      <w:r>
-        <w:rPr>
-          <w:rFonts w:ascii="Arial Unicode MS" w:eastAsia="Arial Unicode MS" w:hAnsi="Arial Unicode MS" w:cs="Arial Unicode MS"/>
-        </w:rPr>
-        <w:t xml:space="preserve">      ↓</w:t>
-      </w:r>
-    </w:p>
-    <w:p>
-      <w:r>
-        <w:t xml:space="preserve">    ISSUE</w:t>
-      </w:r>
-    </w:p>
-    <w:p>
-      <w:pPr>
-        <w:spacing w:before="240" w:after="240"/>
-      </w:pPr>
-      <w:r>
-        <w:t>Do not allow arbitrary status changes.</w:t>
-      </w:r>
-    </w:p>
-    <w:p>
-      <w:pPr>
-        <w:spacing w:before="240" w:after="240"/>
-      </w:pPr>
-      <w:r>
-        <w:t>For example, a Loader should not be able to directly change:</w:t>
-      </w:r>
-    </w:p>
-    <w:p>
-      <w:r>
-        <w:rPr>
-          <w:rFonts w:ascii="Arial Unicode MS" w:eastAsia="Arial Unicode MS" w:hAnsi="Arial Unicode MS" w:cs="Arial Unicode MS"/>
-        </w:rPr>
         <w:t>PENDING → DISPATCHED</w:t>
       </w:r>
     </w:p>
     <w:p>
       <w:r>
-        <w:pict w14:anchorId="36D1602F">
+        <w:pict>
           <v:rect id="_x0000_i1032" style="width:0;height:1.5pt" o:hralign="center" o:hrstd="t" o:hr="t" fillcolor="#a0a0a0" stroked="f"/>
         </w:pict>
       </w:r>
@@ -1586,7 +1584,14 @@
           <w:b/>
           <w:bCs/>
         </w:rPr>
-        <w:t>Physical Stock - Reserved Stock</w:t>
+        <w:t>Physical Stock - R</w:t>
+      </w:r>
+      <w:r>
+        <w:rPr>
+          <w:b/>
+          <w:bCs/>
+        </w:rPr>
+        <w:t>eserved Stock</w:t>
       </w:r>
     </w:p>
     <w:p>
@@ -1618,8 +1623,32 @@
         <w:spacing w:before="240" w:after="240"/>
       </w:pPr>
       <w:r>
+        <w:t>Dispatch A reserves 40.</w:t>
+      </w:r>
+    </w:p>
+    <w:p>
+      <w:pPr>
+        <w:spacing w:before="240" w:after="240"/>
+      </w:pPr>
+      <w:r>
+        <w:t>Available = 60.</w:t>
+      </w:r>
+    </w:p>
+    <w:p>
+      <w:pPr>
+        <w:spacing w:before="240" w:after="240"/>
+      </w:pPr>
+      <w:r>
+        <w:t>Dispatch B cannot reserve 70.</w:t>
+      </w:r>
+    </w:p>
+    <w:p>
+      <w:pPr>
+        <w:spacing w:before="240" w:after="240"/>
+      </w:pPr>
+      <w:r>
         <w:lastRenderedPageBreak/>
-        <w:t>Dispatch A reserves 40.</w:t>
+        <w:t>This prevents over-allocation.</w:t>
       </w:r>
     </w:p>
     <w:p>
@@ -1627,36 +1656,15 @@
         <w:spacing w:before="240" w:after="240"/>
       </w:pPr>
       <w:r>
-        <w:t>Available = 60.</w:t>
-      </w:r>
-    </w:p>
-    <w:p>
-      <w:pPr>
-        <w:spacing w:before="240" w:after="240"/>
-      </w:pPr>
-      <w:r>
-        <w:t>Dispatch B cannot reserve 70.</w:t>
-      </w:r>
-    </w:p>
-    <w:p>
-      <w:pPr>
-        <w:spacing w:before="240" w:after="240"/>
-      </w:pPr>
-      <w:r>
-        <w:t>This prevents over-allocation.</w:t>
-      </w:r>
-    </w:p>
-    <w:p>
-      <w:pPr>
-        <w:spacing w:before="240" w:after="240"/>
-      </w:pPr>
-      <w:r>
-        <w:t>If the client wants a simpler Phase 1, reservation can initially be omitted, but the architecture should leave room for it.</w:t>
-      </w:r>
-    </w:p>
-    <w:p>
-      <w:r>
-        <w:pict w14:anchorId="167EE8C1">
+        <w:t xml:space="preserve">If the client wants a simpler </w:t>
+      </w:r>
+      <w:r>
+        <w:t>Phase 1, reservation can initially be omitted, but the architecture should leave room for it.</w:t>
+      </w:r>
+    </w:p>
+    <w:p>
+      <w:r>
+        <w:pict>
           <v:rect id="_x0000_i1033" style="width:0;height:1.5pt" o:hralign="center" o:hrstd="t" o:hr="t" fillcolor="#a0a0a0" stroked="f"/>
         </w:pict>
       </w:r>
@@ -1774,7 +1782,10 @@
     </w:p>
     <w:p>
       <w:r>
-        <w:t>Report Shortage/Damage if applicable</w:t>
+        <w:t xml:space="preserve">Report </w:t>
+      </w:r>
+      <w:r>
+        <w:t>Shortage/Damage if applicable</w:t>
       </w:r>
     </w:p>
     <w:p>
@@ -1826,7 +1837,7 @@
     </w:p>
     <w:p>
       <w:r>
-        <w:pict w14:anchorId="473A3EF1">
+        <w:pict>
           <v:rect id="_x0000_i1034" style="width:0;height:1.5pt" o:hralign="center" o:hrstd="t" o:hr="t" fillcolor="#a0a0a0" stroked="f"/>
         </w:pict>
       </w:r>
@@ -1871,12 +1882,12 @@
     </w:p>
     <w:p>
       <w:r>
+        <w:t>RB-D-000002</w:t>
+      </w:r>
+    </w:p>
+    <w:p>
+      <w:r>
         <w:lastRenderedPageBreak/>
-        <w:t>RB-D-000002</w:t>
-      </w:r>
-    </w:p>
-    <w:p>
-      <w:r>
         <w:t>RB-D-000003</w:t>
       </w:r>
     </w:p>
@@ -1885,7 +1896,10 @@
         <w:spacing w:before="240" w:after="240"/>
       </w:pPr>
       <w:r>
-        <w:t>Slip should contain:</w:t>
+        <w:t>Slip sh</w:t>
+      </w:r>
+      <w:r>
+        <w:t>ould contain:</w:t>
       </w:r>
     </w:p>
     <w:p>
@@ -2084,12 +2098,15 @@
         <w:spacing w:before="240" w:after="240"/>
       </w:pPr>
       <w:r>
-        <w:t>Architecture can later support thermal printers.</w:t>
-      </w:r>
-    </w:p>
-    <w:p>
-      <w:r>
-        <w:pict w14:anchorId="42ECA102">
+        <w:t xml:space="preserve">Architecture can later </w:t>
+      </w:r>
+      <w:r>
+        <w:t>support thermal printers.</w:t>
+      </w:r>
+    </w:p>
+    <w:p>
+      <w:r>
+        <w:pict>
           <v:rect id="_x0000_i1035" style="width:0;height:1.5pt" o:hralign="center" o:hrstd="t" o:hr="t" fillcolor="#a0a0a0" stroked="f"/>
         </w:pict>
       </w:r>
@@ -2199,15 +2216,15 @@
     </w:p>
     <w:p>
       <w:r>
+        <w:t>DISPATCHED</w:t>
+      </w:r>
+    </w:p>
+    <w:p>
+      <w:pPr>
+        <w:spacing w:before="240" w:after="240"/>
+      </w:pPr>
+      <w:r>
         <w:lastRenderedPageBreak/>
-        <w:t>DISPATCHED</w:t>
-      </w:r>
-    </w:p>
-    <w:p>
-      <w:pPr>
-        <w:spacing w:before="240" w:after="240"/>
-      </w:pPr>
-      <w:r>
         <w:t>Each log should contain:</w:t>
       </w:r>
     </w:p>
@@ -2253,7 +2270,7 @@
     </w:p>
     <w:p>
       <w:r>
-        <w:pict w14:anchorId="1A21640F">
+        <w:pict>
           <v:rect id="_x0000_i1036" style="width:0;height:1.5pt" o:hralign="center" o:hrstd="t" o:hr="t" fillcolor="#a0a0a0" stroked="f"/>
         </w:pict>
       </w:r>
@@ -2280,7 +2297,7 @@
           <w:sz w:val="46"/>
           <w:szCs w:val="46"/>
         </w:rPr>
-        <w:t>12. Frontend Pages</w:t>
+        <w:t>12. Laravel Pages</w:t>
       </w:r>
     </w:p>
     <w:p>
@@ -2483,12 +2500,12 @@
     </w:p>
     <w:p>
       <w:r>
+        <w:t>/loader/dashboard</w:t>
+      </w:r>
+    </w:p>
+    <w:p>
+      <w:r>
         <w:lastRenderedPageBreak/>
-        <w:t>/loader/dashboard</w:t>
-      </w:r>
-    </w:p>
-    <w:p>
-      <w:r>
         <w:t>/loader/tasks</w:t>
       </w:r>
     </w:p>
@@ -2507,12 +2524,15 @@
         <w:spacing w:before="240" w:after="240"/>
       </w:pPr>
       <w:r>
-        <w:t>Loader UI should be significantly simpler than Admin UI.</w:t>
-      </w:r>
-    </w:p>
-    <w:p>
-      <w:r>
-        <w:pict w14:anchorId="78FDB6D5">
+        <w:t>Loader UI should be signific</w:t>
+      </w:r>
+      <w:r>
+        <w:t>antly simpler than Admin UI.</w:t>
+      </w:r>
+    </w:p>
+    <w:p>
+      <w:r>
+        <w:pict>
           <v:rect id="_x0000_i1037" style="width:0;height:1.5pt" o:hralign="center" o:hrstd="t" o:hr="t" fillcolor="#a0a0a0" stroked="f"/>
         </w:pict>
       </w:r>
@@ -2539,7 +2559,7 @@
           <w:sz w:val="46"/>
           <w:szCs w:val="46"/>
         </w:rPr>
-        <w:t>13. API Structure</w:t>
+        <w:t>13. Laravel Routes</w:t>
       </w:r>
     </w:p>
     <w:p>
@@ -2552,150 +2572,158 @@
     </w:p>
     <w:p>
       <w:r>
-        <w:t>POST   /api/auth/login</w:t>
-      </w:r>
-    </w:p>
-    <w:p>
-      <w:r>
-        <w:t>POST   /api/auth/logout</w:t>
-      </w:r>
-    </w:p>
-    <w:p>
-      <w:r>
-        <w:t>GET    /api/me</w:t>
+        <w:t>POST   /login</w:t>
+      </w:r>
+    </w:p>
+    <w:p>
+      <w:r>
+        <w:t>POST   /logout</w:t>
+      </w:r>
+    </w:p>
+    <w:p>
+      <w:r>
+        <w:t>Session current user</w:t>
       </w:r>
     </w:p>
     <w:p/>
     <w:p>
       <w:r>
-        <w:t>GET    /api/products</w:t>
-      </w:r>
-    </w:p>
-    <w:p>
-      <w:r>
-        <w:t>POST   /api/products</w:t>
-      </w:r>
-    </w:p>
-    <w:p>
-      <w:r>
-        <w:t>PUT    /api/products/{id}</w:t>
-      </w:r>
-    </w:p>
-    <w:p>
-      <w:r>
-        <w:t>DELETE /api/products/{id}</w:t>
+        <w:t>GET    /products</w:t>
+      </w:r>
+    </w:p>
+    <w:p>
+      <w:r>
+        <w:t>POST   /products</w:t>
+      </w:r>
+    </w:p>
+    <w:p>
+      <w:r>
+        <w:t>PUT    /products/{id}</w:t>
+      </w:r>
+    </w:p>
+    <w:p>
+      <w:r>
+        <w:t>DELETE /products/{id}</w:t>
       </w:r>
     </w:p>
     <w:p/>
     <w:p>
       <w:r>
-        <w:t>GET    /api/categories</w:t>
-      </w:r>
-    </w:p>
-    <w:p>
-      <w:r>
-        <w:t>GET    /api/brands</w:t>
+        <w:t>GET    /categories</w:t>
+      </w:r>
+    </w:p>
+    <w:p>
+      <w:r>
+        <w:t xml:space="preserve">GET    </w:t>
+      </w:r>
+      <w:r>
+        <w:t>/brands</w:t>
       </w:r>
     </w:p>
     <w:p/>
     <w:p>
       <w:r>
-        <w:t>GET    /api/inventory</w:t>
-      </w:r>
-    </w:p>
-    <w:p>
-      <w:r>
-        <w:t>POST   /api/inventory/stock-in</w:t>
-      </w:r>
-    </w:p>
-    <w:p>
-      <w:r>
-        <w:t>POST   /api/inventory/stock-out</w:t>
-      </w:r>
-    </w:p>
-    <w:p>
-      <w:r>
-        <w:t>POST   /api/inventory/adjust</w:t>
+        <w:t>GET    /inventory</w:t>
+      </w:r>
+    </w:p>
+    <w:p>
+      <w:r>
+        <w:t>POST   /inventory/stock-in</w:t>
+      </w:r>
+    </w:p>
+    <w:p>
+      <w:r>
+        <w:t>POST   /inventory/stock-out</w:t>
+      </w:r>
+    </w:p>
+    <w:p>
+      <w:r>
+        <w:t>POST   /inventory/adjust</w:t>
       </w:r>
     </w:p>
     <w:p/>
     <w:p>
       <w:r>
-        <w:t>GET    /api/stock-movements</w:t>
+        <w:t>GET    /stock-movements</w:t>
       </w:r>
     </w:p>
     <w:p/>
     <w:p>
       <w:r>
-        <w:t>GET    /api/suppliers</w:t>
-      </w:r>
-    </w:p>
-    <w:p>
-      <w:r>
-        <w:t>POST   /api/suppliers</w:t>
+        <w:t>GET    /suppliers</w:t>
+      </w:r>
+    </w:p>
+    <w:p>
+      <w:r>
+        <w:t>POST   /suppliers</w:t>
       </w:r>
     </w:p>
     <w:p/>
     <w:p>
       <w:r>
-        <w:t>GET    /api/purchases</w:t>
-      </w:r>
-    </w:p>
-    <w:p>
-      <w:r>
-        <w:t>POST   /api/purchases</w:t>
+        <w:t>GET    /purchases</w:t>
+      </w:r>
+    </w:p>
+    <w:p>
+      <w:r>
+        <w:t>POST   /purchases</w:t>
       </w:r>
     </w:p>
     <w:p/>
     <w:p>
       <w:r>
-        <w:t>GET    /api/dispatches</w:t>
-      </w:r>
-    </w:p>
-    <w:p>
-      <w:r>
-        <w:t>POST   /api/dispatches</w:t>
-      </w:r>
-    </w:p>
-    <w:p>
-      <w:r>
-        <w:t>POST   /api/dispatches/{id}/assign</w:t>
-      </w:r>
-    </w:p>
-    <w:p>
-      <w:r>
-        <w:t>POST   /api/dispatches/{id}/start-picking</w:t>
-      </w:r>
-    </w:p>
-    <w:p>
-      <w:r>
-        <w:t>POST   /api/dispatches/{id}/confirm-picking</w:t>
-      </w:r>
-    </w:p>
-    <w:p>
-      <w:r>
-        <w:t>POST   /api/dispatches/{id}/pack</w:t>
-      </w:r>
-    </w:p>
-    <w:p>
-      <w:r>
-        <w:t>POST   /api/dispatches/{id}/ready</w:t>
-      </w:r>
-    </w:p>
-    <w:p>
-      <w:r>
-        <w:t>POST   /api/dispatches/{id}/dispatch</w:t>
-      </w:r>
-    </w:p>
-    <w:p>
-      <w:r>
-        <w:t>GET    /api/dispatches/{id}/slip</w:t>
-      </w:r>
-    </w:p>
-    <w:p>
-      <w:r>
-        <w:lastRenderedPageBreak/>
-        <w:pict w14:anchorId="6AEEF961">
+        <w:t xml:space="preserve">GET    </w:t>
+      </w:r>
+      <w:r>
+        <w:t>/dispatches</w:t>
+      </w:r>
+    </w:p>
+    <w:p>
+      <w:r>
+        <w:t>POST   /dispatches</w:t>
+      </w:r>
+    </w:p>
+    <w:p>
+      <w:r>
+        <w:t>POST   /dispatches/{id}/assign</w:t>
+      </w:r>
+    </w:p>
+    <w:p>
+      <w:r>
+        <w:t>POST   /dispatches/{id}/start-picking</w:t>
+      </w:r>
+    </w:p>
+    <w:p>
+      <w:r>
+        <w:t>POST   /dispatches/{id}/confirm-picking</w:t>
+      </w:r>
+    </w:p>
+    <w:p>
+      <w:r>
+        <w:t>POST   /dispatches/{id}/pack</w:t>
+      </w:r>
+    </w:p>
+    <w:p>
+      <w:r>
+        <w:t>POST   /dispatches/{id}/ready</w:t>
+      </w:r>
+    </w:p>
+    <w:p>
+      <w:r>
+        <w:t xml:space="preserve">POST   </w:t>
+      </w:r>
+      <w:r>
+        <w:t>/dispatches/{id}/dispatch</w:t>
+      </w:r>
+    </w:p>
+    <w:p>
+      <w:r>
+        <w:t>GET    /dispatches/{id}/slip</w:t>
+      </w:r>
+    </w:p>
+    <w:p>
+      <w:r>
+        <w:pict>
           <v:rect id="_x0000_i1038" style="width:0;height:1.5pt" o:hralign="center" o:hrstd="t" o:hr="t" fillcolor="#a0a0a0" stroked="f"/>
         </w:pict>
       </w:r>
@@ -2722,6 +2750,7 @@
           <w:sz w:val="46"/>
           <w:szCs w:val="46"/>
         </w:rPr>
+        <w:lastRenderedPageBreak/>
         <w:t>14. Development Sequence</w:t>
       </w:r>
     </w:p>
@@ -2788,7 +2817,7 @@
         </w:numPr>
       </w:pPr>
       <w:r>
-        <w:t>React setup</w:t>
+        <w:t>Laravel pages</w:t>
       </w:r>
     </w:p>
     <w:p>
@@ -2855,7 +2884,7 @@
         <w:spacing w:after="240"/>
       </w:pPr>
       <w:r>
-        <w:t>API architecture</w:t>
+        <w:t>Route architecture</w:t>
       </w:r>
     </w:p>
     <w:p>
@@ -2954,7 +2983,10 @@
         </w:numPr>
       </w:pPr>
       <w:r>
-        <w:t>Search</w:t>
+        <w:t>S</w:t>
+      </w:r>
+      <w:r>
+        <w:t>earch</w:t>
       </w:r>
     </w:p>
     <w:p>
@@ -3177,7 +3209,6 @@
         <w:spacing w:after="240"/>
       </w:pPr>
       <w:r>
-        <w:lastRenderedPageBreak/>
         <w:t>Automatic stock updates</w:t>
       </w:r>
     </w:p>
@@ -3205,6 +3236,7 @@
           <w:sz w:val="26"/>
           <w:szCs w:val="26"/>
         </w:rPr>
+        <w:lastRenderedPageBreak/>
         <w:t>Sprint 5</w:t>
       </w:r>
     </w:p>
@@ -3560,7 +3592,7 @@
     </w:p>
     <w:p>
       <w:r>
-        <w:pict w14:anchorId="28AD2AAE">
+        <w:pict>
           <v:rect id="_x0000_i1039" style="width:0;height:1.5pt" o:hralign="center" o:hrstd="t" o:hr="t" fillcolor="#a0a0a0" stroked="f"/>
         </w:pict>
       </w:r>
@@ -3635,29 +3667,29 @@
         </w:numPr>
       </w:pPr>
       <w:r>
+        <w:t>Employee login</w:t>
+      </w:r>
+    </w:p>
+    <w:p>
+      <w:pPr>
+        <w:numPr>
+          <w:ilvl w:val="0"/>
+          <w:numId w:val="18"/>
+        </w:numPr>
+      </w:pPr>
+      <w:r>
+        <w:t>Loader login</w:t>
+      </w:r>
+    </w:p>
+    <w:p>
+      <w:pPr>
+        <w:numPr>
+          <w:ilvl w:val="0"/>
+          <w:numId w:val="18"/>
+        </w:numPr>
+      </w:pPr>
+      <w:r>
         <w:lastRenderedPageBreak/>
-        <w:t>Employee login</w:t>
-      </w:r>
-    </w:p>
-    <w:p>
-      <w:pPr>
-        <w:numPr>
-          <w:ilvl w:val="0"/>
-          <w:numId w:val="18"/>
-        </w:numPr>
-      </w:pPr>
-      <w:r>
-        <w:t>Loader login</w:t>
-      </w:r>
-    </w:p>
-    <w:p>
-      <w:pPr>
-        <w:numPr>
-          <w:ilvl w:val="0"/>
-          <w:numId w:val="18"/>
-        </w:numPr>
-      </w:pPr>
-      <w:r>
         <w:t>Logout</w:t>
       </w:r>
     </w:p>
@@ -3751,7 +3783,10 @@
         </w:numPr>
       </w:pPr>
       <w:r>
-        <w:t>Backend permission enforcement</w:t>
+        <w:t xml:space="preserve">Backend </w:t>
+      </w:r>
+      <w:r>
+        <w:t>permission enforcement</w:t>
       </w:r>
     </w:p>
     <w:p>
@@ -3763,7 +3798,7 @@
         <w:spacing w:after="240"/>
       </w:pPr>
       <w:r>
-        <w:t>Unauthorized API requests blocked</w:t>
+        <w:t>Unauthorized requests blocked</w:t>
       </w:r>
     </w:p>
     <w:p>
@@ -3992,7 +4027,10 @@
         </w:numPr>
       </w:pPr>
       <w:r>
-        <w:t>Stock ledger</w:t>
+        <w:t xml:space="preserve">Stock </w:t>
+      </w:r>
+      <w:r>
+        <w:t>ledger</w:t>
       </w:r>
     </w:p>
     <w:p>
@@ -4107,30 +4145,30 @@
         </w:numPr>
       </w:pPr>
       <w:r>
+        <w:t>Purchase items</w:t>
+      </w:r>
+    </w:p>
+    <w:p>
+      <w:pPr>
+        <w:numPr>
+          <w:ilvl w:val="0"/>
+          <w:numId w:val="3"/>
+        </w:numPr>
+      </w:pPr>
+      <w:r>
+        <w:t>Automatic stock increase</w:t>
+      </w:r>
+    </w:p>
+    <w:p>
+      <w:pPr>
+        <w:numPr>
+          <w:ilvl w:val="0"/>
+          <w:numId w:val="3"/>
+        </w:numPr>
+        <w:spacing w:after="240"/>
+      </w:pPr>
+      <w:r>
         <w:lastRenderedPageBreak/>
-        <w:t>Purchase items</w:t>
-      </w:r>
-    </w:p>
-    <w:p>
-      <w:pPr>
-        <w:numPr>
-          <w:ilvl w:val="0"/>
-          <w:numId w:val="3"/>
-        </w:numPr>
-      </w:pPr>
-      <w:r>
-        <w:t>Automatic stock increase</w:t>
-      </w:r>
-    </w:p>
-    <w:p>
-      <w:pPr>
-        <w:numPr>
-          <w:ilvl w:val="0"/>
-          <w:numId w:val="3"/>
-        </w:numPr>
-        <w:spacing w:after="240"/>
-      </w:pPr>
-      <w:r>
         <w:t>Purchase history</w:t>
       </w:r>
     </w:p>
@@ -4190,7 +4228,10 @@
         </w:numPr>
       </w:pPr>
       <w:r>
-        <w:t>Item selection</w:t>
+        <w:t xml:space="preserve">Item </w:t>
+      </w:r>
+      <w:r>
+        <w:t>selection</w:t>
       </w:r>
     </w:p>
     <w:p>
@@ -4393,7 +4434,10 @@
         </w:numPr>
       </w:pPr>
       <w:r>
-        <w:t>Employee details</w:t>
+        <w:t>Employee det</w:t>
+      </w:r>
+      <w:r>
+        <w:t>ails</w:t>
       </w:r>
     </w:p>
     <w:p>
@@ -4596,7 +4640,6 @@
         </w:numPr>
       </w:pPr>
       <w:r>
-        <w:lastRenderedPageBreak/>
         <w:t>Excel/CSV export</w:t>
       </w:r>
     </w:p>
@@ -4634,6 +4677,7 @@
           <w:sz w:val="34"/>
           <w:szCs w:val="34"/>
         </w:rPr>
+        <w:lastRenderedPageBreak/>
         <w:t>Audit</w:t>
       </w:r>
     </w:p>
@@ -4805,7 +4849,10 @@
         </w:numPr>
       </w:pPr>
       <w:r>
-        <w:t>Test dispatch quantity validation</w:t>
+        <w:t>Test</w:t>
+      </w:r>
+      <w:r>
+        <w:t xml:space="preserve"> dispatch quantity validation</w:t>
       </w:r>
     </w:p>
     <w:p>
@@ -4866,7 +4913,7 @@
     </w:p>
     <w:p>
       <w:r>
-        <w:pict w14:anchorId="75D9F940">
+        <w:pict>
           <v:rect id="_x0000_i1040" style="width:0;height:1.5pt" o:hralign="center" o:hrstd="t" o:hr="t" fillcolor="#a0a0a0" stroked="f"/>
         </w:pict>
       </w:r>
@@ -4910,7 +4957,14 @@
           <w:b/>
           <w:bCs/>
         </w:rPr>
-        <w:t>Do not build this as a collection of CRUD screens. Build it as a transaction-based inventory system. Every meaningful stock change must have a source, user, timestamp, reason/reference and audit trail. Physical warehouse operations must be separated from inventory authorization.</w:t>
+        <w:t>Do not build this as a collection of CRUD screens. Build it as a transaction-based</w:t>
+      </w:r>
+      <w:r>
+        <w:rPr>
+          <w:b/>
+          <w:bCs/>
+        </w:rPr>
+        <w:t xml:space="preserve"> inventory system. Every meaningful stock change must have a source, user, timestamp, reason/reference and audit trail. Physical warehouse operations must be separated from inventory authorization.</w:t>
       </w:r>
     </w:p>
     <w:p>
@@ -4918,7 +4972,10 @@
         <w:spacing w:before="240" w:after="240"/>
       </w:pPr>
       <w:r>
-        <w:t>That single architectural decision will prevent a lot of problems later.</w:t>
+        <w:t>That single architectural decision will prevent a lot of p</w:t>
+      </w:r>
+      <w:r>
+        <w:t>roblems later.</w:t>
       </w:r>
     </w:p>
     <w:p>
@@ -4964,7 +5021,15 @@
           <w:b/>
           <w:bCs/>
         </w:rPr>
-        <w:t>stock → picking → packing → ready for dispatch → dispatch</w:t>
+        <w:t>stock → picking → packing → ready for dispat</w:t>
+      </w:r>
+      <w:r>
+        <w:rPr>
+          <w:rFonts w:ascii="Arial Unicode MS" w:eastAsia="Arial Unicode MS" w:hAnsi="Arial Unicode MS" w:cs="Arial Unicode MS"/>
+          <w:b/>
+          <w:bCs/>
+        </w:rPr>
+        <w:t>ch → dispatch</w:t>
       </w:r>
       <w:r>
         <w:t>.</w:t>
@@ -4981,8 +5046,8 @@
 </file>
 
 <file path=word/numbering.xml><?xml version="1.0" encoding="utf-8"?>
-<w:numbering xmlns:wpc="http://schemas.microsoft.com/office/word/2010/wordprocessingCanvas" xmlns:cx="http://schemas.microsoft.com/office/drawing/2014/chartex" xmlns:cx1="http://schemas.microsoft.com/office/drawing/2015/9/8/chartex" xmlns:cx2="http://schemas.microsoft.com/office/drawing/2015/10/21/chartex" xmlns:cx3="http://schemas.microsoft.com/office/drawing/2016/5/9/chartex" xmlns:cx4="http://schemas.microsoft.com/office/drawing/2016/5/10/chartex" xmlns:cx5="http://schemas.microsoft.com/office/drawing/2016/5/11/chartex" xmlns:cx6="http://schemas.microsoft.com/office/drawing/2016/5/12/chartex" xmlns:cx7="http://schemas.microsoft.com/office/drawing/2016/5/13/chartex" xmlns:cx8="http://schemas.microsoft.com/office/drawing/2016/5/14/chartex" xmlns:mc="http://schemas.openxmlformats.org/markup-compatibility/2006" xmlns:aink="http://schemas.microsoft.com/office/drawing/2016/ink" xmlns:am3d="http://schemas.microsoft.com/office/drawing/2017/model3d" xmlns:o="urn:schemas-microsoft-com:office:office" xmlns:oel="http://schemas.microsoft.com/office/2019/extlst" xmlns:r="http://schemas.openxmlformats.org/officeDocument/2006/relationships" xmlns:m="http://schemas.openxmlformats.org/officeDocument/2006/math" xmlns:v="urn:schemas-microsoft-com:vml" xmlns:wp14="http://schemas.microsoft.com/office/word/2010/wordprocessingDrawing" xmlns:wp="http://schemas.openxmlformats.org/drawingml/2006/wordprocessingDrawing" xmlns:w10="urn:schemas-microsoft-com:office:word" xmlns:w="http://schemas.openxmlformats.org/wordprocessingml/2006/main" xmlns:w14="http://schemas.microsoft.com/office/word/2010/wordml" xmlns:w15="http://schemas.microsoft.com/office/word/2012/wordml" xmlns:w16cex="http://schemas.microsoft.com/office/word/2018/wordml/cex" xmlns:w16cid="http://schemas.microsoft.com/office/word/2016/wordml/cid" xmlns:w16="http://schemas.microsoft.com/office/word/2018/wordml" xmlns:w16du="http://schemas.microsoft.com/office/word/2023/wordml/word16du" xmlns:w16sdtdh="http://schemas.microsoft.com/office/word/2020/wordml/sdtdatahash" xmlns:w16sdtfl="http://schemas.microsoft.com/office/word/2024/wordml/sdtformatlock" xmlns:w16se="http://schemas.microsoft.com/office/word/2015/wordml/symex" xmlns:wpg="http://schemas.microsoft.com/office/word/2010/wordprocessingGroup" xmlns:wpi="http://schemas.microsoft.com/office/word/2010/wordprocessingInk" xmlns:wne="http://schemas.microsoft.com/office/word/2006/wordml" xmlns:wps="http://schemas.microsoft.com/office/word/2010/wordprocessingShape" mc:Ignorable="w14 w15 w16se w16cid w16 w16cex w16sdtdh w16sdtfl w16du wp14">
-  <w:abstractNum w:abstractNumId="0" w15:restartNumberingAfterBreak="0">
+<w:numbering xmlns:ve="http://schemas.openxmlformats.org/markup-compatibility/2006" xmlns:o="urn:schemas-microsoft-com:office:office" xmlns:r="http://schemas.openxmlformats.org/officeDocument/2006/relationships" xmlns:m="http://schemas.openxmlformats.org/officeDocument/2006/math" xmlns:v="urn:schemas-microsoft-com:vml" xmlns:wp="http://schemas.openxmlformats.org/drawingml/2006/wordprocessingDrawing" xmlns:w10="urn:schemas-microsoft-com:office:word" xmlns:w="http://schemas.openxmlformats.org/wordprocessingml/2006/main" xmlns:wne="http://schemas.microsoft.com/office/word/2006/wordml">
+  <w:abstractNum w:abstractNumId="0">
     <w:nsid w:val="00235C53"/>
     <w:multiLevelType w:val="multilevel"/>
     <w:tmpl w:val="67C44B8C"/>
@@ -5095,7 +5160,7 @@
       </w:rPr>
     </w:lvl>
   </w:abstractNum>
-  <w:abstractNum w:abstractNumId="1" w15:restartNumberingAfterBreak="0">
+  <w:abstractNum w:abstractNumId="1">
     <w:nsid w:val="018205F0"/>
     <w:multiLevelType w:val="multilevel"/>
     <w:tmpl w:val="0274605C"/>
@@ -5208,7 +5273,7 @@
       </w:rPr>
     </w:lvl>
   </w:abstractNum>
-  <w:abstractNum w:abstractNumId="2" w15:restartNumberingAfterBreak="0">
+  <w:abstractNum w:abstractNumId="2">
     <w:nsid w:val="056A6A81"/>
     <w:multiLevelType w:val="multilevel"/>
     <w:tmpl w:val="6E820520"/>
@@ -5321,7 +5386,7 @@
       </w:rPr>
     </w:lvl>
   </w:abstractNum>
-  <w:abstractNum w:abstractNumId="3" w15:restartNumberingAfterBreak="0">
+  <w:abstractNum w:abstractNumId="3">
     <w:nsid w:val="05C50FC1"/>
     <w:multiLevelType w:val="multilevel"/>
     <w:tmpl w:val="3E12AA18"/>
@@ -5434,7 +5499,7 @@
       </w:rPr>
     </w:lvl>
   </w:abstractNum>
-  <w:abstractNum w:abstractNumId="4" w15:restartNumberingAfterBreak="0">
+  <w:abstractNum w:abstractNumId="4">
     <w:nsid w:val="090C4935"/>
     <w:multiLevelType w:val="multilevel"/>
     <w:tmpl w:val="90AE0A68"/>
@@ -5547,7 +5612,7 @@
       </w:rPr>
     </w:lvl>
   </w:abstractNum>
-  <w:abstractNum w:abstractNumId="5" w15:restartNumberingAfterBreak="0">
+  <w:abstractNum w:abstractNumId="5">
     <w:nsid w:val="17C93C10"/>
     <w:multiLevelType w:val="multilevel"/>
     <w:tmpl w:val="D25A6C52"/>
@@ -5660,7 +5725,7 @@
       </w:rPr>
     </w:lvl>
   </w:abstractNum>
-  <w:abstractNum w:abstractNumId="6" w15:restartNumberingAfterBreak="0">
+  <w:abstractNum w:abstractNumId="6">
     <w:nsid w:val="1A247B55"/>
     <w:multiLevelType w:val="multilevel"/>
     <w:tmpl w:val="868AEE86"/>
@@ -5773,7 +5838,7 @@
       </w:rPr>
     </w:lvl>
   </w:abstractNum>
-  <w:abstractNum w:abstractNumId="7" w15:restartNumberingAfterBreak="0">
+  <w:abstractNum w:abstractNumId="7">
     <w:nsid w:val="1BC510D9"/>
     <w:multiLevelType w:val="multilevel"/>
     <w:tmpl w:val="176CE25E"/>
@@ -5886,7 +5951,7 @@
       </w:rPr>
     </w:lvl>
   </w:abstractNum>
-  <w:abstractNum w:abstractNumId="8" w15:restartNumberingAfterBreak="0">
+  <w:abstractNum w:abstractNumId="8">
     <w:nsid w:val="2EFD5028"/>
     <w:multiLevelType w:val="multilevel"/>
     <w:tmpl w:val="8C563E4E"/>
@@ -5999,7 +6064,7 @@
       </w:rPr>
     </w:lvl>
   </w:abstractNum>
-  <w:abstractNum w:abstractNumId="9" w15:restartNumberingAfterBreak="0">
+  <w:abstractNum w:abstractNumId="9">
     <w:nsid w:val="2F9B0604"/>
     <w:multiLevelType w:val="multilevel"/>
     <w:tmpl w:val="EF86A5F2"/>
@@ -6112,7 +6177,7 @@
       </w:rPr>
     </w:lvl>
   </w:abstractNum>
-  <w:abstractNum w:abstractNumId="10" w15:restartNumberingAfterBreak="0">
+  <w:abstractNum w:abstractNumId="10">
     <w:nsid w:val="31FA0071"/>
     <w:multiLevelType w:val="multilevel"/>
     <w:tmpl w:val="15F0D77E"/>
@@ -6225,7 +6290,7 @@
       </w:rPr>
     </w:lvl>
   </w:abstractNum>
-  <w:abstractNum w:abstractNumId="11" w15:restartNumberingAfterBreak="0">
+  <w:abstractNum w:abstractNumId="11">
     <w:nsid w:val="3AB86FB8"/>
     <w:multiLevelType w:val="multilevel"/>
     <w:tmpl w:val="5088DF92"/>
@@ -6338,7 +6403,7 @@
       </w:rPr>
     </w:lvl>
   </w:abstractNum>
-  <w:abstractNum w:abstractNumId="12" w15:restartNumberingAfterBreak="0">
+  <w:abstractNum w:abstractNumId="12">
     <w:nsid w:val="5FCA07B4"/>
     <w:multiLevelType w:val="multilevel"/>
     <w:tmpl w:val="6744FEE6"/>
@@ -6451,7 +6516,7 @@
       </w:rPr>
     </w:lvl>
   </w:abstractNum>
-  <w:abstractNum w:abstractNumId="13" w15:restartNumberingAfterBreak="0">
+  <w:abstractNum w:abstractNumId="13">
     <w:nsid w:val="60420A82"/>
     <w:multiLevelType w:val="multilevel"/>
     <w:tmpl w:val="375ACDB6"/>
@@ -6564,7 +6629,7 @@
       </w:rPr>
     </w:lvl>
   </w:abstractNum>
-  <w:abstractNum w:abstractNumId="14" w15:restartNumberingAfterBreak="0">
+  <w:abstractNum w:abstractNumId="14">
     <w:nsid w:val="691C278F"/>
     <w:multiLevelType w:val="multilevel"/>
     <w:tmpl w:val="9940C362"/>
@@ -6677,7 +6742,7 @@
       </w:rPr>
     </w:lvl>
   </w:abstractNum>
-  <w:abstractNum w:abstractNumId="15" w15:restartNumberingAfterBreak="0">
+  <w:abstractNum w:abstractNumId="15">
     <w:nsid w:val="6CC47872"/>
     <w:multiLevelType w:val="multilevel"/>
     <w:tmpl w:val="1B42FD12"/>
@@ -6790,7 +6855,7 @@
       </w:rPr>
     </w:lvl>
   </w:abstractNum>
-  <w:abstractNum w:abstractNumId="16" w15:restartNumberingAfterBreak="0">
+  <w:abstractNum w:abstractNumId="16">
     <w:nsid w:val="706C418C"/>
     <w:multiLevelType w:val="multilevel"/>
     <w:tmpl w:val="D536FD54"/>
@@ -6903,7 +6968,7 @@
       </w:rPr>
     </w:lvl>
   </w:abstractNum>
-  <w:abstractNum w:abstractNumId="17" w15:restartNumberingAfterBreak="0">
+  <w:abstractNum w:abstractNumId="17">
     <w:nsid w:val="7CE10A72"/>
     <w:multiLevelType w:val="multilevel"/>
     <w:tmpl w:val="D0BC7148"/>
@@ -7016,65 +7081,65 @@
       </w:rPr>
     </w:lvl>
   </w:abstractNum>
-  <w:num w:numId="1" w16cid:durableId="2143884407">
+  <w:num w:numId="1">
     <w:abstractNumId w:val="13"/>
   </w:num>
-  <w:num w:numId="2" w16cid:durableId="66079793">
+  <w:num w:numId="2">
     <w:abstractNumId w:val="6"/>
   </w:num>
-  <w:num w:numId="3" w16cid:durableId="59452531">
+  <w:num w:numId="3">
     <w:abstractNumId w:val="12"/>
   </w:num>
-  <w:num w:numId="4" w16cid:durableId="1881478252">
+  <w:num w:numId="4">
     <w:abstractNumId w:val="15"/>
   </w:num>
-  <w:num w:numId="5" w16cid:durableId="843280723">
+  <w:num w:numId="5">
     <w:abstractNumId w:val="11"/>
   </w:num>
-  <w:num w:numId="6" w16cid:durableId="1840073529">
+  <w:num w:numId="6">
     <w:abstractNumId w:val="16"/>
   </w:num>
-  <w:num w:numId="7" w16cid:durableId="695544964">
+  <w:num w:numId="7">
     <w:abstractNumId w:val="17"/>
   </w:num>
-  <w:num w:numId="8" w16cid:durableId="28654138">
+  <w:num w:numId="8">
     <w:abstractNumId w:val="4"/>
   </w:num>
-  <w:num w:numId="9" w16cid:durableId="1094478323">
+  <w:num w:numId="9">
     <w:abstractNumId w:val="14"/>
   </w:num>
-  <w:num w:numId="10" w16cid:durableId="722947397">
+  <w:num w:numId="10">
     <w:abstractNumId w:val="10"/>
   </w:num>
-  <w:num w:numId="11" w16cid:durableId="923412726">
+  <w:num w:numId="11">
     <w:abstractNumId w:val="2"/>
   </w:num>
-  <w:num w:numId="12" w16cid:durableId="2142192422">
+  <w:num w:numId="12">
     <w:abstractNumId w:val="8"/>
   </w:num>
-  <w:num w:numId="13" w16cid:durableId="146476980">
+  <w:num w:numId="13">
     <w:abstractNumId w:val="5"/>
   </w:num>
-  <w:num w:numId="14" w16cid:durableId="952512597">
+  <w:num w:numId="14">
     <w:abstractNumId w:val="0"/>
   </w:num>
-  <w:num w:numId="15" w16cid:durableId="1938639236">
+  <w:num w:numId="15">
     <w:abstractNumId w:val="9"/>
   </w:num>
-  <w:num w:numId="16" w16cid:durableId="264657685">
+  <w:num w:numId="16">
     <w:abstractNumId w:val="3"/>
   </w:num>
-  <w:num w:numId="17" w16cid:durableId="490676726">
+  <w:num w:numId="17">
     <w:abstractNumId w:val="7"/>
   </w:num>
-  <w:num w:numId="18" w16cid:durableId="1659764877">
+  <w:num w:numId="18">
     <w:abstractNumId w:val="1"/>
   </w:num>
 </w:numbering>
 </file>
 
 <file path=word/styles.xml><?xml version="1.0" encoding="utf-8"?>
-<w:styles xmlns:mc="http://schemas.openxmlformats.org/markup-compatibility/2006" xmlns:r="http://schemas.openxmlformats.org/officeDocument/2006/relationships" xmlns:w="http://schemas.openxmlformats.org/wordprocessingml/2006/main" xmlns:w14="http://schemas.microsoft.com/office/word/2010/wordml" xmlns:w15="http://schemas.microsoft.com/office/word/2012/wordml" xmlns:w16cex="http://schemas.microsoft.com/office/word/2018/wordml/cex" xmlns:w16cid="http://schemas.microsoft.com/office/word/2016/wordml/cid" xmlns:w16="http://schemas.microsoft.com/office/word/2018/wordml" xmlns:w16du="http://schemas.microsoft.com/office/word/2023/wordml/word16du" xmlns:w16sdtdh="http://schemas.microsoft.com/office/word/2020/wordml/sdtdatahash" xmlns:w16sdtfl="http://schemas.microsoft.com/office/word/2024/wordml/sdtformatlock" xmlns:w16se="http://schemas.microsoft.com/office/word/2015/wordml/symex" mc:Ignorable="w14 w15 w16se w16cid w16 w16cex w16sdtdh w16sdtfl w16du">
+<w:styles xmlns:r="http://schemas.openxmlformats.org/officeDocument/2006/relationships" xmlns:w="http://schemas.openxmlformats.org/wordprocessingml/2006/main">
   <w:docDefaults>
     <w:rPrDefault>
       <w:rPr>
@@ -7090,387 +7155,149 @@
       </w:pPr>
     </w:pPrDefault>
   </w:docDefaults>
-  <w:latentStyles w:defLockedState="0" w:defUIPriority="99" w:defSemiHidden="0" w:defUnhideWhenUsed="0" w:defQFormat="0" w:count="376">
-    <w:lsdException w:name="Normal" w:uiPriority="0" w:qFormat="1"/>
-    <w:lsdException w:name="heading 1" w:uiPriority="9" w:qFormat="1"/>
-    <w:lsdException w:name="heading 2" w:semiHidden="1" w:uiPriority="9" w:unhideWhenUsed="1" w:qFormat="1"/>
-    <w:lsdException w:name="heading 3" w:semiHidden="1" w:uiPriority="9" w:unhideWhenUsed="1" w:qFormat="1"/>
-    <w:lsdException w:name="heading 4" w:semiHidden="1" w:uiPriority="9" w:unhideWhenUsed="1" w:qFormat="1"/>
-    <w:lsdException w:name="heading 5" w:semiHidden="1" w:uiPriority="9" w:unhideWhenUsed="1" w:qFormat="1"/>
-    <w:lsdException w:name="heading 6" w:semiHidden="1" w:uiPriority="9" w:unhideWhenUsed="1" w:qFormat="1"/>
-    <w:lsdException w:name="heading 7" w:semiHidden="1" w:uiPriority="9" w:unhideWhenUsed="1" w:qFormat="1"/>
-    <w:lsdException w:name="heading 8" w:semiHidden="1" w:uiPriority="9" w:unhideWhenUsed="1" w:qFormat="1"/>
-    <w:lsdException w:name="heading 9" w:semiHidden="1" w:uiPriority="9" w:unhideWhenUsed="1" w:qFormat="1"/>
-    <w:lsdException w:name="index 1" w:semiHidden="1" w:unhideWhenUsed="1"/>
-    <w:lsdException w:name="index 2" w:semiHidden="1" w:unhideWhenUsed="1"/>
-    <w:lsdException w:name="index 3" w:semiHidden="1" w:unhideWhenUsed="1"/>
-    <w:lsdException w:name="index 4" w:semiHidden="1" w:unhideWhenUsed="1"/>
-    <w:lsdException w:name="index 5" w:semiHidden="1" w:unhideWhenUsed="1"/>
-    <w:lsdException w:name="index 6" w:semiHidden="1" w:unhideWhenUsed="1"/>
-    <w:lsdException w:name="index 7" w:semiHidden="1" w:unhideWhenUsed="1"/>
-    <w:lsdException w:name="index 8" w:semiHidden="1" w:unhideWhenUsed="1"/>
-    <w:lsdException w:name="index 9" w:semiHidden="1" w:unhideWhenUsed="1"/>
-    <w:lsdException w:name="toc 1" w:semiHidden="1" w:uiPriority="39" w:unhideWhenUsed="1"/>
-    <w:lsdException w:name="toc 2" w:semiHidden="1" w:uiPriority="39" w:unhideWhenUsed="1"/>
-    <w:lsdException w:name="toc 3" w:semiHidden="1" w:uiPriority="39" w:unhideWhenUsed="1"/>
-    <w:lsdException w:name="toc 4" w:semiHidden="1" w:uiPriority="39" w:unhideWhenUsed="1"/>
-    <w:lsdException w:name="toc 5" w:semiHidden="1" w:uiPriority="39" w:unhideWhenUsed="1"/>
-    <w:lsdException w:name="toc 6" w:semiHidden="1" w:uiPriority="39" w:unhideWhenUsed="1"/>
-    <w:lsdException w:name="toc 7" w:semiHidden="1" w:uiPriority="39" w:unhideWhenUsed="1"/>
-    <w:lsdException w:name="toc 8" w:semiHidden="1" w:uiPriority="39" w:unhideWhenUsed="1"/>
-    <w:lsdException w:name="toc 9" w:semiHidden="1" w:uiPriority="39" w:unhideWhenUsed="1"/>
-    <w:lsdException w:name="Normal Indent" w:semiHidden="1" w:unhideWhenUsed="1"/>
-    <w:lsdException w:name="footnote text" w:semiHidden="1" w:unhideWhenUsed="1"/>
-    <w:lsdException w:name="annotation text" w:semiHidden="1" w:unhideWhenUsed="1"/>
-    <w:lsdException w:name="header" w:semiHidden="1" w:unhideWhenUsed="1"/>
-    <w:lsdException w:name="footer" w:semiHidden="1" w:unhideWhenUsed="1"/>
-    <w:lsdException w:name="index heading" w:semiHidden="1" w:unhideWhenUsed="1"/>
-    <w:lsdException w:name="caption" w:semiHidden="1" w:uiPriority="35" w:unhideWhenUsed="1" w:qFormat="1"/>
-    <w:lsdException w:name="table of figures" w:semiHidden="1" w:unhideWhenUsed="1"/>
-    <w:lsdException w:name="envelope address" w:semiHidden="1" w:unhideWhenUsed="1"/>
-    <w:lsdException w:name="envelope return" w:semiHidden="1" w:unhideWhenUsed="1"/>
-    <w:lsdException w:name="footnote reference" w:semiHidden="1" w:unhideWhenUsed="1"/>
-    <w:lsdException w:name="annotation reference" w:semiHidden="1" w:unhideWhenUsed="1"/>
-    <w:lsdException w:name="line number" w:semiHidden="1" w:unhideWhenUsed="1"/>
-    <w:lsdException w:name="page number" w:semiHidden="1" w:unhideWhenUsed="1"/>
-    <w:lsdException w:name="endnote reference" w:semiHidden="1" w:unhideWhenUsed="1"/>
-    <w:lsdException w:name="endnote text" w:semiHidden="1" w:unhideWhenUsed="1"/>
-    <w:lsdException w:name="table of authorities" w:semiHidden="1" w:unhideWhenUsed="1"/>
-    <w:lsdException w:name="macro" w:semiHidden="1" w:unhideWhenUsed="1"/>
-    <w:lsdException w:name="toa heading" w:semiHidden="1" w:unhideWhenUsed="1"/>
-    <w:lsdException w:name="List" w:semiHidden="1" w:unhideWhenUsed="1"/>
-    <w:lsdException w:name="List Bullet" w:semiHidden="1" w:unhideWhenUsed="1"/>
-    <w:lsdException w:name="List Number" w:semiHidden="1" w:unhideWhenUsed="1"/>
-    <w:lsdException w:name="List 2" w:semiHidden="1" w:unhideWhenUsed="1"/>
-    <w:lsdException w:name="List 3" w:semiHidden="1" w:unhideWhenUsed="1"/>
-    <w:lsdException w:name="List 4" w:semiHidden="1" w:unhideWhenUsed="1"/>
-    <w:lsdException w:name="List 5" w:semiHidden="1" w:unhideWhenUsed="1"/>
-    <w:lsdException w:name="List Bullet 2" w:semiHidden="1" w:unhideWhenUsed="1"/>
-    <w:lsdException w:name="List Bullet 3" w:semiHidden="1" w:unhideWhenUsed="1"/>
-    <w:lsdException w:name="List Bullet 4" w:semiHidden="1" w:unhideWhenUsed="1"/>
-    <w:lsdException w:name="List Bullet 5" w:semiHidden="1" w:unhideWhenUsed="1"/>
-    <w:lsdException w:name="List Number 2" w:semiHidden="1" w:unhideWhenUsed="1"/>
-    <w:lsdException w:name="List Number 3" w:semiHidden="1" w:unhideWhenUsed="1"/>
-    <w:lsdException w:name="List Number 4" w:semiHidden="1" w:unhideWhenUsed="1"/>
-    <w:lsdException w:name="List Number 5" w:semiHidden="1" w:unhideWhenUsed="1"/>
-    <w:lsdException w:name="Title" w:uiPriority="10" w:qFormat="1"/>
-    <w:lsdException w:name="Closing" w:semiHidden="1" w:unhideWhenUsed="1"/>
-    <w:lsdException w:name="Signature" w:semiHidden="1" w:unhideWhenUsed="1"/>
-    <w:lsdException w:name="Default Paragraph Font" w:semiHidden="1" w:uiPriority="1" w:unhideWhenUsed="1"/>
-    <w:lsdException w:name="Body Text" w:semiHidden="1" w:unhideWhenUsed="1"/>
-    <w:lsdException w:name="Body Text Indent" w:semiHidden="1" w:unhideWhenUsed="1"/>
-    <w:lsdException w:name="List Continue" w:semiHidden="1" w:unhideWhenUsed="1"/>
-    <w:lsdException w:name="List Continue 2" w:semiHidden="1" w:unhideWhenUsed="1"/>
-    <w:lsdException w:name="List Continue 3" w:semiHidden="1" w:unhideWhenUsed="1"/>
-    <w:lsdException w:name="List Continue 4" w:semiHidden="1" w:unhideWhenUsed="1"/>
-    <w:lsdException w:name="List Continue 5" w:semiHidden="1" w:unhideWhenUsed="1"/>
-    <w:lsdException w:name="Message Header" w:semiHidden="1" w:unhideWhenUsed="1"/>
-    <w:lsdException w:name="Subtitle" w:uiPriority="11" w:qFormat="1"/>
-    <w:lsdException w:name="Salutation" w:semiHidden="1" w:unhideWhenUsed="1"/>
-    <w:lsdException w:name="Date" w:semiHidden="1" w:unhideWhenUsed="1"/>
-    <w:lsdException w:name="Body Text First Indent" w:semiHidden="1" w:unhideWhenUsed="1"/>
-    <w:lsdException w:name="Body Text First Indent 2" w:semiHidden="1" w:unhideWhenUsed="1"/>
-    <w:lsdException w:name="Note Heading" w:semiHidden="1" w:unhideWhenUsed="1"/>
-    <w:lsdException w:name="Body Text 2" w:semiHidden="1" w:unhideWhenUsed="1"/>
-    <w:lsdException w:name="Body Text 3" w:semiHidden="1" w:unhideWhenUsed="1"/>
-    <w:lsdException w:name="Body Text Indent 2" w:semiHidden="1" w:unhideWhenUsed="1"/>
-    <w:lsdException w:name="Body Text Indent 3" w:semiHidden="1" w:unhideWhenUsed="1"/>
-    <w:lsdException w:name="Block Text" w:semiHidden="1" w:unhideWhenUsed="1"/>
-    <w:lsdException w:name="Hyperlink" w:semiHidden="1" w:unhideWhenUsed="1"/>
-    <w:lsdException w:name="FollowedHyperlink" w:semiHidden="1" w:unhideWhenUsed="1"/>
-    <w:lsdException w:name="Strong" w:uiPriority="22" w:qFormat="1"/>
-    <w:lsdException w:name="Emphasis" w:uiPriority="20" w:qFormat="1"/>
-    <w:lsdException w:name="Document Map" w:semiHidden="1" w:unhideWhenUsed="1"/>
-    <w:lsdException w:name="Plain Text" w:semiHidden="1" w:unhideWhenUsed="1"/>
-    <w:lsdException w:name="E-mail Signature" w:semiHidden="1" w:unhideWhenUsed="1"/>
-    <w:lsdException w:name="HTML Top of Form" w:semiHidden="1" w:unhideWhenUsed="1"/>
-    <w:lsdException w:name="HTML Bottom of Form" w:semiHidden="1" w:unhideWhenUsed="1"/>
-    <w:lsdException w:name="Normal (Web)" w:semiHidden="1" w:unhideWhenUsed="1"/>
-    <w:lsdException w:name="HTML Acronym" w:semiHidden="1" w:unhideWhenUsed="1"/>
-    <w:lsdException w:name="HTML Address" w:semiHidden="1" w:unhideWhenUsed="1"/>
-    <w:lsdException w:name="HTML Cite" w:semiHidden="1" w:unhideWhenUsed="1"/>
-    <w:lsdException w:name="HTML Code" w:semiHidden="1" w:unhideWhenUsed="1"/>
-    <w:lsdException w:name="HTML Definition" w:semiHidden="1" w:unhideWhenUsed="1"/>
-    <w:lsdException w:name="HTML Keyboard" w:semiHidden="1" w:unhideWhenUsed="1"/>
-    <w:lsdException w:name="HTML Preformatted" w:semiHidden="1" w:unhideWhenUsed="1"/>
-    <w:lsdException w:name="HTML Sample" w:semiHidden="1" w:unhideWhenUsed="1"/>
-    <w:lsdException w:name="HTML Typewriter" w:semiHidden="1" w:unhideWhenUsed="1"/>
-    <w:lsdException w:name="HTML Variable" w:semiHidden="1" w:unhideWhenUsed="1"/>
-    <w:lsdException w:name="Normal Table" w:semiHidden="1" w:unhideWhenUsed="1"/>
-    <w:lsdException w:name="annotation subject" w:semiHidden="1" w:unhideWhenUsed="1"/>
-    <w:lsdException w:name="No List" w:semiHidden="1" w:unhideWhenUsed="1"/>
-    <w:lsdException w:name="Outline List 1" w:semiHidden="1" w:unhideWhenUsed="1"/>
-    <w:lsdException w:name="Outline List 2" w:semiHidden="1" w:unhideWhenUsed="1"/>
-    <w:lsdException w:name="Outline List 3" w:semiHidden="1" w:unhideWhenUsed="1"/>
-    <w:lsdException w:name="Table Simple 1" w:semiHidden="1" w:unhideWhenUsed="1"/>
-    <w:lsdException w:name="Table Simple 2" w:semiHidden="1" w:unhideWhenUsed="1"/>
-    <w:lsdException w:name="Table Simple 3" w:semiHidden="1" w:unhideWhenUsed="1"/>
-    <w:lsdException w:name="Table Classic 1" w:semiHidden="1" w:unhideWhenUsed="1"/>
-    <w:lsdException w:name="Table Classic 2" w:semiHidden="1" w:unhideWhenUsed="1"/>
-    <w:lsdException w:name="Table Classic 3" w:semiHidden="1" w:unhideWhenUsed="1"/>
-    <w:lsdException w:name="Table Classic 4" w:semiHidden="1" w:unhideWhenUsed="1"/>
-    <w:lsdException w:name="Table Colorful 1" w:semiHidden="1" w:unhideWhenUsed="1"/>
-    <w:lsdException w:name="Table Colorful 2" w:semiHidden="1" w:unhideWhenUsed="1"/>
-    <w:lsdException w:name="Table Colorful 3" w:semiHidden="1" w:unhideWhenUsed="1"/>
-    <w:lsdException w:name="Table Columns 1" w:semiHidden="1" w:unhideWhenUsed="1"/>
-    <w:lsdException w:name="Table Columns 2" w:semiHidden="1" w:unhideWhenUsed="1"/>
-    <w:lsdException w:name="Table Columns 3" w:semiHidden="1" w:unhideWhenUsed="1"/>
-    <w:lsdException w:name="Table Columns 4" w:semiHidden="1" w:unhideWhenUsed="1"/>
-    <w:lsdException w:name="Table Columns 5" w:semiHidden="1" w:unhideWhenUsed="1"/>
-    <w:lsdException w:name="Table Grid 1" w:semiHidden="1" w:unhideWhenUsed="1"/>
-    <w:lsdException w:name="Table Grid 2" w:semiHidden="1" w:unhideWhenUsed="1"/>
-    <w:lsdException w:name="Table Grid 3" w:semiHidden="1" w:unhideWhenUsed="1"/>
-    <w:lsdException w:name="Table Grid 4" w:semiHidden="1" w:unhideWhenUsed="1"/>
-    <w:lsdException w:name="Table Grid 5" w:semiHidden="1" w:unhideWhenUsed="1"/>
-    <w:lsdException w:name="Table Grid 6" w:semiHidden="1" w:unhideWhenUsed="1"/>
-    <w:lsdException w:name="Table Grid 7" w:semiHidden="1" w:unhideWhenUsed="1"/>
-    <w:lsdException w:name="Table Grid 8" w:semiHidden="1" w:unhideWhenUsed="1"/>
-    <w:lsdException w:name="Table List 1" w:semiHidden="1" w:unhideWhenUsed="1"/>
-    <w:lsdException w:name="Table List 2" w:semiHidden="1" w:unhideWhenUsed="1"/>
-    <w:lsdException w:name="Table List 3" w:semiHidden="1" w:unhideWhenUsed="1"/>
-    <w:lsdException w:name="Table List 4" w:semiHidden="1" w:unhideWhenUsed="1"/>
-    <w:lsdException w:name="Table List 5" w:semiHidden="1" w:unhideWhenUsed="1"/>
-    <w:lsdException w:name="Table List 6" w:semiHidden="1" w:unhideWhenUsed="1"/>
-    <w:lsdException w:name="Table List 7" w:semiHidden="1" w:unhideWhenUsed="1"/>
-    <w:lsdException w:name="Table List 8" w:semiHidden="1" w:unhideWhenUsed="1"/>
-    <w:lsdException w:name="Table 3D effects 1" w:semiHidden="1" w:unhideWhenUsed="1"/>
-    <w:lsdException w:name="Table 3D effects 2" w:semiHidden="1" w:unhideWhenUsed="1"/>
-    <w:lsdException w:name="Table 3D effects 3" w:semiHidden="1" w:unhideWhenUsed="1"/>
-    <w:lsdException w:name="Table Contemporary" w:semiHidden="1" w:unhideWhenUsed="1"/>
-    <w:lsdException w:name="Table Elegant" w:semiHidden="1" w:unhideWhenUsed="1"/>
-    <w:lsdException w:name="Table Professional" w:semiHidden="1" w:unhideWhenUsed="1"/>
-    <w:lsdException w:name="Table Subtle 1" w:semiHidden="1" w:unhideWhenUsed="1"/>
-    <w:lsdException w:name="Table Subtle 2" w:semiHidden="1" w:unhideWhenUsed="1"/>
-    <w:lsdException w:name="Table Web 1" w:semiHidden="1" w:unhideWhenUsed="1"/>
-    <w:lsdException w:name="Table Web 2" w:semiHidden="1" w:unhideWhenUsed="1"/>
-    <w:lsdException w:name="Table Web 3" w:semiHidden="1" w:unhideWhenUsed="1"/>
-    <w:lsdException w:name="Balloon Text" w:semiHidden="1" w:unhideWhenUsed="1"/>
-    <w:lsdException w:name="Table Grid" w:uiPriority="39"/>
-    <w:lsdException w:name="Table Theme" w:semiHidden="1" w:unhideWhenUsed="1"/>
-    <w:lsdException w:name="Placeholder Text" w:semiHidden="1"/>
-    <w:lsdException w:name="No Spacing" w:uiPriority="1" w:qFormat="1"/>
-    <w:lsdException w:name="Light Shading" w:uiPriority="60"/>
-    <w:lsdException w:name="Light List" w:uiPriority="61"/>
-    <w:lsdException w:name="Light Grid" w:uiPriority="62"/>
-    <w:lsdException w:name="Medium Shading 1" w:uiPriority="63"/>
-    <w:lsdException w:name="Medium Shading 2" w:uiPriority="64"/>
-    <w:lsdException w:name="Medium List 1" w:uiPriority="65"/>
-    <w:lsdException w:name="Medium List 2" w:uiPriority="66"/>
-    <w:lsdException w:name="Medium Grid 1" w:uiPriority="67"/>
-    <w:lsdException w:name="Medium Grid 2" w:uiPriority="68"/>
-    <w:lsdException w:name="Medium Grid 3" w:uiPriority="69"/>
-    <w:lsdException w:name="Dark List" w:uiPriority="70"/>
-    <w:lsdException w:name="Colorful Shading" w:uiPriority="71"/>
-    <w:lsdException w:name="Colorful List" w:uiPriority="72"/>
-    <w:lsdException w:name="Colorful Grid" w:uiPriority="73"/>
-    <w:lsdException w:name="Light Shading Accent 1" w:uiPriority="60"/>
-    <w:lsdException w:name="Light List Accent 1" w:uiPriority="61"/>
-    <w:lsdException w:name="Light Grid Accent 1" w:uiPriority="62"/>
-    <w:lsdException w:name="Medium Shading 1 Accent 1" w:uiPriority="63"/>
-    <w:lsdException w:name="Medium Shading 2 Accent 1" w:uiPriority="64"/>
-    <w:lsdException w:name="Medium List 1 Accent 1" w:uiPriority="65"/>
-    <w:lsdException w:name="Revision" w:semiHidden="1"/>
-    <w:lsdException w:name="List Paragraph" w:uiPriority="34" w:qFormat="1"/>
-    <w:lsdException w:name="Quote" w:uiPriority="29" w:qFormat="1"/>
-    <w:lsdException w:name="Intense Quote" w:uiPriority="30" w:qFormat="1"/>
-    <w:lsdException w:name="Medium List 2 Accent 1" w:uiPriority="66"/>
-    <w:lsdException w:name="Medium Grid 1 Accent 1" w:uiPriority="67"/>
-    <w:lsdException w:name="Medium Grid 2 Accent 1" w:uiPriority="68"/>
-    <w:lsdException w:name="Medium Grid 3 Accent 1" w:uiPriority="69"/>
-    <w:lsdException w:name="Dark List Accent 1" w:uiPriority="70"/>
-    <w:lsdException w:name="Colorful Shading Accent 1" w:uiPriority="71"/>
-    <w:lsdException w:name="Colorful List Accent 1" w:uiPriority="72"/>
-    <w:lsdException w:name="Colorful Grid Accent 1" w:uiPriority="73"/>
-    <w:lsdException w:name="Light Shading Accent 2" w:uiPriority="60"/>
-    <w:lsdException w:name="Light List Accent 2" w:uiPriority="61"/>
-    <w:lsdException w:name="Light Grid Accent 2" w:uiPriority="62"/>
-    <w:lsdException w:name="Medium Shading 1 Accent 2" w:uiPriority="63"/>
-    <w:lsdException w:name="Medium Shading 2 Accent 2" w:uiPriority="64"/>
-    <w:lsdException w:name="Medium List 1 Accent 2" w:uiPriority="65"/>
-    <w:lsdException w:name="Medium List 2 Accent 2" w:uiPriority="66"/>
-    <w:lsdException w:name="Medium Grid 1 Accent 2" w:uiPriority="67"/>
-    <w:lsdException w:name="Medium Grid 2 Accent 2" w:uiPriority="68"/>
-    <w:lsdException w:name="Medium Grid 3 Accent 2" w:uiPriority="69"/>
-    <w:lsdException w:name="Dark List Accent 2" w:uiPriority="70"/>
-    <w:lsdException w:name="Colorful Shading Accent 2" w:uiPriority="71"/>
-    <w:lsdException w:name="Colorful List Accent 2" w:uiPriority="72"/>
-    <w:lsdException w:name="Colorful Grid Accent 2" w:uiPriority="73"/>
-    <w:lsdException w:name="Light Shading Accent 3" w:uiPriority="60"/>
-    <w:lsdException w:name="Light List Accent 3" w:uiPriority="61"/>
-    <w:lsdException w:name="Light Grid Accent 3" w:uiPriority="62"/>
-    <w:lsdException w:name="Medium Shading 1 Accent 3" w:uiPriority="63"/>
-    <w:lsdException w:name="Medium Shading 2 Accent 3" w:uiPriority="64"/>
-    <w:lsdException w:name="Medium List 1 Accent 3" w:uiPriority="65"/>
-    <w:lsdException w:name="Medium List 2 Accent 3" w:uiPriority="66"/>
-    <w:lsdException w:name="Medium Grid 1 Accent 3" w:uiPriority="67"/>
-    <w:lsdException w:name="Medium Grid 2 Accent 3" w:uiPriority="68"/>
-    <w:lsdException w:name="Medium Grid 3 Accent 3" w:uiPriority="69"/>
-    <w:lsdException w:name="Dark List Accent 3" w:uiPriority="70"/>
-    <w:lsdException w:name="Colorful Shading Accent 3" w:uiPriority="71"/>
-    <w:lsdException w:name="Colorful List Accent 3" w:uiPriority="72"/>
-    <w:lsdException w:name="Colorful Grid Accent 3" w:uiPriority="73"/>
-    <w:lsdException w:name="Light Shading Accent 4" w:uiPriority="60"/>
-    <w:lsdException w:name="Light List Accent 4" w:uiPriority="61"/>
-    <w:lsdException w:name="Light Grid Accent 4" w:uiPriority="62"/>
-    <w:lsdException w:name="Medium Shading 1 Accent 4" w:uiPriority="63"/>
-    <w:lsdException w:name="Medium Shading 2 Accent 4" w:uiPriority="64"/>
-    <w:lsdException w:name="Medium List 1 Accent 4" w:uiPriority="65"/>
-    <w:lsdException w:name="Medium List 2 Accent 4" w:uiPriority="66"/>
-    <w:lsdException w:name="Medium Grid 1 Accent 4" w:uiPriority="67"/>
-    <w:lsdException w:name="Medium Grid 2 Accent 4" w:uiPriority="68"/>
-    <w:lsdException w:name="Medium Grid 3 Accent 4" w:uiPriority="69"/>
-    <w:lsdException w:name="Dark List Accent 4" w:uiPriority="70"/>
-    <w:lsdException w:name="Colorful Shading Accent 4" w:uiPriority="71"/>
-    <w:lsdException w:name="Colorful List Accent 4" w:uiPriority="72"/>
-    <w:lsdException w:name="Colorful Grid Accent 4" w:uiPriority="73"/>
-    <w:lsdException w:name="Light Shading Accent 5" w:uiPriority="60"/>
-    <w:lsdException w:name="Light List Accent 5" w:uiPriority="61"/>
-    <w:lsdException w:name="Light Grid Accent 5" w:uiPriority="62"/>
-    <w:lsdException w:name="Medium Shading 1 Accent 5" w:uiPriority="63"/>
-    <w:lsdException w:name="Medium Shading 2 Accent 5" w:uiPriority="64"/>
-    <w:lsdException w:name="Medium List 1 Accent 5" w:uiPriority="65"/>
-    <w:lsdException w:name="Medium List 2 Accent 5" w:uiPriority="66"/>
-    <w:lsdException w:name="Medium Grid 1 Accent 5" w:uiPriority="67"/>
-    <w:lsdException w:name="Medium Grid 2 Accent 5" w:uiPriority="68"/>
-    <w:lsdException w:name="Medium Grid 3 Accent 5" w:uiPriority="69"/>
-    <w:lsdException w:name="Dark List Accent 5" w:uiPriority="70"/>
-    <w:lsdException w:name="Colorful Shading Accent 5" w:uiPriority="71"/>
-    <w:lsdException w:name="Colorful List Accent 5" w:uiPriority="72"/>
-    <w:lsdException w:name="Colorful Grid Accent 5" w:uiPriority="73"/>
-    <w:lsdException w:name="Light Shading Accent 6" w:uiPriority="60"/>
-    <w:lsdException w:name="Light List Accent 6" w:uiPriority="61"/>
-    <w:lsdException w:name="Light Grid Accent 6" w:uiPriority="62"/>
-    <w:lsdException w:name="Medium Shading 1 Accent 6" w:uiPriority="63"/>
-    <w:lsdException w:name="Medium Shading 2 Accent 6" w:uiPriority="64"/>
-    <w:lsdException w:name="Medium List 1 Accent 6" w:uiPriority="65"/>
-    <w:lsdException w:name="Medium List 2 Accent 6" w:uiPriority="66"/>
-    <w:lsdException w:name="Medium Grid 1 Accent 6" w:uiPriority="67"/>
-    <w:lsdException w:name="Medium Grid 2 Accent 6" w:uiPriority="68"/>
-    <w:lsdException w:name="Medium Grid 3 Accent 6" w:uiPriority="69"/>
-    <w:lsdException w:name="Dark List Accent 6" w:uiPriority="70"/>
-    <w:lsdException w:name="Colorful Shading Accent 6" w:uiPriority="71"/>
-    <w:lsdException w:name="Colorful List Accent 6" w:uiPriority="72"/>
-    <w:lsdException w:name="Colorful Grid Accent 6" w:uiPriority="73"/>
-    <w:lsdException w:name="Subtle Emphasis" w:uiPriority="19" w:qFormat="1"/>
-    <w:lsdException w:name="Intense Emphasis" w:uiPriority="21" w:qFormat="1"/>
-    <w:lsdException w:name="Subtle Reference" w:uiPriority="31" w:qFormat="1"/>
-    <w:lsdException w:name="Intense Reference" w:uiPriority="32" w:qFormat="1"/>
-    <w:lsdException w:name="Book Title" w:uiPriority="33" w:qFormat="1"/>
-    <w:lsdException w:name="Bibliography" w:semiHidden="1" w:uiPriority="37" w:unhideWhenUsed="1"/>
-    <w:lsdException w:name="TOC Heading" w:semiHidden="1" w:uiPriority="39" w:unhideWhenUsed="1" w:qFormat="1"/>
-    <w:lsdException w:name="Plain Table 1" w:uiPriority="41"/>
-    <w:lsdException w:name="Plain Table 2" w:uiPriority="42"/>
-    <w:lsdException w:name="Plain Table 3" w:uiPriority="43"/>
-    <w:lsdException w:name="Plain Table 4" w:uiPriority="44"/>
-    <w:lsdException w:name="Plain Table 5" w:uiPriority="45"/>
-    <w:lsdException w:name="Grid Table Light" w:uiPriority="40"/>
-    <w:lsdException w:name="Grid Table 1 Light" w:uiPriority="46"/>
-    <w:lsdException w:name="Grid Table 2" w:uiPriority="47"/>
-    <w:lsdException w:name="Grid Table 3" w:uiPriority="48"/>
-    <w:lsdException w:name="Grid Table 4" w:uiPriority="49"/>
-    <w:lsdException w:name="Grid Table 5 Dark" w:uiPriority="50"/>
-    <w:lsdException w:name="Grid Table 6 Colorful" w:uiPriority="51"/>
-    <w:lsdException w:name="Grid Table 7 Colorful" w:uiPriority="52"/>
-    <w:lsdException w:name="Grid Table 1 Light Accent 1" w:uiPriority="46"/>
-    <w:lsdException w:name="Grid Table 2 Accent 1" w:uiPriority="47"/>
-    <w:lsdException w:name="Grid Table 3 Accent 1" w:uiPriority="48"/>
-    <w:lsdException w:name="Grid Table 4 Accent 1" w:uiPriority="49"/>
-    <w:lsdException w:name="Grid Table 5 Dark Accent 1" w:uiPriority="50"/>
-    <w:lsdException w:name="Grid Table 6 Colorful Accent 1" w:uiPriority="51"/>
-    <w:lsdException w:name="Grid Table 7 Colorful Accent 1" w:uiPriority="52"/>
-    <w:lsdException w:name="Grid Table 1 Light Accent 2" w:uiPriority="46"/>
-    <w:lsdException w:name="Grid Table 2 Accent 2" w:uiPriority="47"/>
-    <w:lsdException w:name="Grid Table 3 Accent 2" w:uiPriority="48"/>
-    <w:lsdException w:name="Grid Table 4 Accent 2" w:uiPriority="49"/>
-    <w:lsdException w:name="Grid Table 5 Dark Accent 2" w:uiPriority="50"/>
-    <w:lsdException w:name="Grid Table 6 Colorful Accent 2" w:uiPriority="51"/>
-    <w:lsdException w:name="Grid Table 7 Colorful Accent 2" w:uiPriority="52"/>
-    <w:lsdException w:name="Grid Table 1 Light Accent 3" w:uiPriority="46"/>
-    <w:lsdException w:name="Grid Table 2 Accent 3" w:uiPriority="47"/>
-    <w:lsdException w:name="Grid Table 3 Accent 3" w:uiPriority="48"/>
-    <w:lsdException w:name="Grid Table 4 Accent 3" w:uiPriority="49"/>
-    <w:lsdException w:name="Grid Table 5 Dark Accent 3" w:uiPriority="50"/>
-    <w:lsdException w:name="Grid Table 6 Colorful Accent 3" w:uiPriority="51"/>
-    <w:lsdException w:name="Grid Table 7 Colorful Accent 3" w:uiPriority="52"/>
-    <w:lsdException w:name="Grid Table 1 Light Accent 4" w:uiPriority="46"/>
-    <w:lsdException w:name="Grid Table 2 Accent 4" w:uiPriority="47"/>
-    <w:lsdException w:name="Grid Table 3 Accent 4" w:uiPriority="48"/>
-    <w:lsdException w:name="Grid Table 4 Accent 4" w:uiPriority="49"/>
-    <w:lsdException w:name="Grid Table 5 Dark Accent 4" w:uiPriority="50"/>
-    <w:lsdException w:name="Grid Table 6 Colorful Accent 4" w:uiPriority="51"/>
-    <w:lsdException w:name="Grid Table 7 Colorful Accent 4" w:uiPriority="52"/>
-    <w:lsdException w:name="Grid Table 1 Light Accent 5" w:uiPriority="46"/>
-    <w:lsdException w:name="Grid Table 2 Accent 5" w:uiPriority="47"/>
-    <w:lsdException w:name="Grid Table 3 Accent 5" w:uiPriority="48"/>
-    <w:lsdException w:name="Grid Table 4 Accent 5" w:uiPriority="49"/>
-    <w:lsdException w:name="Grid Table 5 Dark Accent 5" w:uiPriority="50"/>
-    <w:lsdException w:name="Grid Table 6 Colorful Accent 5" w:uiPriority="51"/>
-    <w:lsdException w:name="Grid Table 7 Colorful Accent 5" w:uiPriority="52"/>
-    <w:lsdException w:name="Grid Table 1 Light Accent 6" w:uiPriority="46"/>
-    <w:lsdException w:name="Grid Table 2 Accent 6" w:uiPriority="47"/>
-    <w:lsdException w:name="Grid Table 3 Accent 6" w:uiPriority="48"/>
-    <w:lsdException w:name="Grid Table 4 Accent 6" w:uiPriority="49"/>
-    <w:lsdException w:name="Grid Table 5 Dark Accent 6" w:uiPriority="50"/>
-    <w:lsdException w:name="Grid Table 6 Colorful Accent 6" w:uiPriority="51"/>
-    <w:lsdException w:name="Grid Table 7 Colorful Accent 6" w:uiPriority="52"/>
-    <w:lsdException w:name="List Table 1 Light" w:uiPriority="46"/>
-    <w:lsdException w:name="List Table 2" w:uiPriority="47"/>
-    <w:lsdException w:name="List Table 3" w:uiPriority="48"/>
-    <w:lsdException w:name="List Table 4" w:uiPriority="49"/>
-    <w:lsdException w:name="List Table 5 Dark" w:uiPriority="50"/>
-    <w:lsdException w:name="List Table 6 Colorful" w:uiPriority="51"/>
-    <w:lsdException w:name="List Table 7 Colorful" w:uiPriority="52"/>
-    <w:lsdException w:name="List Table 1 Light Accent 1" w:uiPriority="46"/>
-    <w:lsdException w:name="List Table 2 Accent 1" w:uiPriority="47"/>
-    <w:lsdException w:name="List Table 3 Accent 1" w:uiPriority="48"/>
-    <w:lsdException w:name="List Table 4 Accent 1" w:uiPriority="49"/>
-    <w:lsdException w:name="List Table 5 Dark Accent 1" w:uiPriority="50"/>
-    <w:lsdException w:name="List Table 6 Colorful Accent 1" w:uiPriority="51"/>
-    <w:lsdException w:name="List Table 7 Colorful Accent 1" w:uiPriority="52"/>
-    <w:lsdException w:name="List Table 1 Light Accent 2" w:uiPriority="46"/>
-    <w:lsdException w:name="List Table 2 Accent 2" w:uiPriority="47"/>
-    <w:lsdException w:name="List Table 3 Accent 2" w:uiPriority="48"/>
-    <w:lsdException w:name="List Table 4 Accent 2" w:uiPriority="49"/>
-    <w:lsdException w:name="List Table 5 Dark Accent 2" w:uiPriority="50"/>
-    <w:lsdException w:name="List Table 6 Colorful Accent 2" w:uiPriority="51"/>
-    <w:lsdException w:name="List Table 7 Colorful Accent 2" w:uiPriority="52"/>
-    <w:lsdException w:name="List Table 1 Light Accent 3" w:uiPriority="46"/>
-    <w:lsdException w:name="List Table 2 Accent 3" w:uiPriority="47"/>
-    <w:lsdException w:name="List Table 3 Accent 3" w:uiPriority="48"/>
-    <w:lsdException w:name="List Table 4 Accent 3" w:uiPriority="49"/>
-    <w:lsdException w:name="List Table 5 Dark Accent 3" w:uiPriority="50"/>
-    <w:lsdException w:name="List Table 6 Colorful Accent 3" w:uiPriority="51"/>
-    <w:lsdException w:name="List Table 7 Colorful Accent 3" w:uiPriority="52"/>
-    <w:lsdException w:name="List Table 1 Light Accent 4" w:uiPriority="46"/>
-    <w:lsdException w:name="List Table 2 Accent 4" w:uiPriority="47"/>
-    <w:lsdException w:name="List Table 3 Accent 4" w:uiPriority="48"/>
-    <w:lsdException w:name="List Table 4 Accent 4" w:uiPriority="49"/>
-    <w:lsdException w:name="List Table 5 Dark Accent 4" w:uiPriority="50"/>
-    <w:lsdException w:name="List Table 6 Colorful Accent 4" w:uiPriority="51"/>
-    <w:lsdException w:name="List Table 7 Colorful Accent 4" w:uiPriority="52"/>
-    <w:lsdException w:name="List Table 1 Light Accent 5" w:uiPriority="46"/>
-    <w:lsdException w:name="List Table 2 Accent 5" w:uiPriority="47"/>
-    <w:lsdException w:name="List Table 3 Accent 5" w:uiPriority="48"/>
-    <w:lsdException w:name="List Table 4 Accent 5" w:uiPriority="49"/>
-    <w:lsdException w:name="List Table 5 Dark Accent 5" w:uiPriority="50"/>
-    <w:lsdException w:name="List Table 6 Colorful Accent 5" w:uiPriority="51"/>
-    <w:lsdException w:name="List Table 7 Colorful Accent 5" w:uiPriority="52"/>
-    <w:lsdException w:name="List Table 1 Light Accent 6" w:uiPriority="46"/>
-    <w:lsdException w:name="List Table 2 Accent 6" w:uiPriority="47"/>
-    <w:lsdException w:name="List Table 3 Accent 6" w:uiPriority="48"/>
-    <w:lsdException w:name="List Table 4 Accent 6" w:uiPriority="49"/>
-    <w:lsdException w:name="List Table 5 Dark Accent 6" w:uiPriority="50"/>
-    <w:lsdException w:name="List Table 6 Colorful Accent 6" w:uiPriority="51"/>
-    <w:lsdException w:name="List Table 7 Colorful Accent 6" w:uiPriority="52"/>
-    <w:lsdException w:name="Mention" w:semiHidden="1" w:unhideWhenUsed="1"/>
-    <w:lsdException w:name="Smart Hyperlink" w:semiHidden="1" w:unhideWhenUsed="1"/>
-    <w:lsdException w:name="Hashtag" w:semiHidden="1" w:unhideWhenUsed="1"/>
-    <w:lsdException w:name="Unresolved Mention" w:semiHidden="1" w:unhideWhenUsed="1"/>
-    <w:lsdException w:name="Smart Link" w:semiHidden="1" w:unhideWhenUsed="1"/>
+  <w:latentStyles w:defLockedState="0" w:defUIPriority="99" w:defSemiHidden="1" w:defUnhideWhenUsed="1" w:defQFormat="0" w:count="267">
+    <w:lsdException w:name="Normal" w:semiHidden="0" w:uiPriority="0" w:unhideWhenUsed="0" w:qFormat="1"/>
+    <w:lsdException w:name="heading 1" w:semiHidden="0" w:uiPriority="9" w:unhideWhenUsed="0" w:qFormat="1"/>
+    <w:lsdException w:name="heading 2" w:uiPriority="9" w:qFormat="1"/>
+    <w:lsdException w:name="heading 3" w:uiPriority="9" w:qFormat="1"/>
+    <w:lsdException w:name="heading 4" w:uiPriority="9" w:qFormat="1"/>
+    <w:lsdException w:name="heading 5" w:uiPriority="9" w:qFormat="1"/>
+    <w:lsdException w:name="heading 6" w:uiPriority="9" w:qFormat="1"/>
+    <w:lsdException w:name="heading 7" w:uiPriority="9" w:qFormat="1"/>
+    <w:lsdException w:name="heading 8" w:uiPriority="9" w:qFormat="1"/>
+    <w:lsdException w:name="heading 9" w:uiPriority="9" w:qFormat="1"/>
+    <w:lsdException w:name="toc 1" w:uiPriority="39"/>
+    <w:lsdException w:name="toc 2" w:uiPriority="39"/>
+    <w:lsdException w:name="toc 3" w:uiPriority="39"/>
+    <w:lsdException w:name="toc 4" w:uiPriority="39"/>
+    <w:lsdException w:name="toc 5" w:uiPriority="39"/>
+    <w:lsdException w:name="toc 6" w:uiPriority="39"/>
+    <w:lsdException w:name="toc 7" w:uiPriority="39"/>
+    <w:lsdException w:name="toc 8" w:uiPriority="39"/>
+    <w:lsdException w:name="toc 9" w:uiPriority="39"/>
+    <w:lsdException w:name="caption" w:uiPriority="35" w:qFormat="1"/>
+    <w:lsdException w:name="Title" w:semiHidden="0" w:uiPriority="10" w:unhideWhenUsed="0" w:qFormat="1"/>
+    <w:lsdException w:name="Default Paragraph Font" w:uiPriority="1"/>
+    <w:lsdException w:name="Subtitle" w:semiHidden="0" w:uiPriority="11" w:unhideWhenUsed="0" w:qFormat="1"/>
+    <w:lsdException w:name="Strong" w:semiHidden="0" w:uiPriority="22" w:unhideWhenUsed="0" w:qFormat="1"/>
+    <w:lsdException w:name="Emphasis" w:semiHidden="0" w:uiPriority="20" w:unhideWhenUsed="0" w:qFormat="1"/>
+    <w:lsdException w:name="Table Grid" w:semiHidden="0" w:uiPriority="39" w:unhideWhenUsed="0"/>
+    <w:lsdException w:name="Placeholder Text" w:unhideWhenUsed="0"/>
+    <w:lsdException w:name="No Spacing" w:semiHidden="0" w:uiPriority="1" w:unhideWhenUsed="0" w:qFormat="1"/>
+    <w:lsdException w:name="Light Shading" w:semiHidden="0" w:uiPriority="60" w:unhideWhenUsed="0"/>
+    <w:lsdException w:name="Light List" w:semiHidden="0" w:uiPriority="61" w:unhideWhenUsed="0"/>
+    <w:lsdException w:name="Light Grid" w:semiHidden="0" w:uiPriority="62" w:unhideWhenUsed="0"/>
+    <w:lsdException w:name="Medium Shading 1" w:semiHidden="0" w:uiPriority="63" w:unhideWhenUsed="0"/>
+    <w:lsdException w:name="Medium Shading 2" w:semiHidden="0" w:uiPriority="64" w:unhideWhenUsed="0"/>
+    <w:lsdException w:name="Medium List 1" w:semiHidden="0" w:uiPriority="65" w:unhideWhenUsed="0"/>
+    <w:lsdException w:name="Medium List 2" w:semiHidden="0" w:uiPriority="66" w:unhideWhenUsed="0"/>
+    <w:lsdException w:name="Medium Grid 1" w:semiHidden="0" w:uiPriority="67" w:unhideWhenUsed="0"/>
+    <w:lsdException w:name="Medium Grid 2" w:semiHidden="0" w:uiPriority="68" w:unhideWhenUsed="0"/>
+    <w:lsdException w:name="Medium Grid 3" w:semiHidden="0" w:uiPriority="69" w:unhideWhenUsed="0"/>
+    <w:lsdException w:name="Dark List" w:semiHidden="0" w:uiPriority="70" w:unhideWhenUsed="0"/>
+    <w:lsdException w:name="Colorful Shading" w:semiHidden="0" w:uiPriority="71" w:unhideWhenUsed="0"/>
+    <w:lsdException w:name="Colorful List" w:semiHidden="0" w:uiPriority="72" w:unhideWhenUsed="0"/>
+    <w:lsdException w:name="Colorful Grid" w:semiHidden="0" w:uiPriority="73" w:unhideWhenUsed="0"/>
+    <w:lsdException w:name="Light Shading Accent 1" w:semiHidden="0" w:uiPriority="60" w:unhideWhenUsed="0"/>
+    <w:lsdException w:name="Light List Accent 1" w:semiHidden="0" w:uiPriority="61" w:unhideWhenUsed="0"/>
+    <w:lsdException w:name="Light Grid Accent 1" w:semiHidden="0" w:uiPriority="62" w:unhideWhenUsed="0"/>
+    <w:lsdException w:name="Medium Shading 1 Accent 1" w:semiHidden="0" w:uiPriority="63" w:unhideWhenUsed="0"/>
+    <w:lsdException w:name="Medium Shading 2 Accent 1" w:semiHidden="0" w:uiPriority="64" w:unhideWhenUsed="0"/>
+    <w:lsdException w:name="Medium List 1 Accent 1" w:semiHidden="0" w:uiPriority="65" w:unhideWhenUsed="0"/>
+    <w:lsdException w:name="Revision" w:unhideWhenUsed="0"/>
+    <w:lsdException w:name="List Paragraph" w:semiHidden="0" w:uiPriority="34" w:unhideWhenUsed="0" w:qFormat="1"/>
+    <w:lsdException w:name="Quote" w:semiHidden="0" w:uiPriority="29" w:unhideWhenUsed="0" w:qFormat="1"/>
+    <w:lsdException w:name="Intense Quote" w:semiHidden="0" w:uiPriority="30" w:unhideWhenUsed="0" w:qFormat="1"/>
+    <w:lsdException w:name="Medium List 2 Accent 1" w:semiHidden="0" w:uiPriority="66" w:unhideWhenUsed="0"/>
+    <w:lsdException w:name="Medium Grid 1 Accent 1" w:semiHidden="0" w:uiPriority="67" w:unhideWhenUsed="0"/>
+    <w:lsdException w:name="Medium Grid 2 Accent 1" w:semiHidden="0" w:uiPriority="68" w:unhideWhenUsed="0"/>
+    <w:lsdException w:name="Medium Grid 3 Accent 1" w:semiHidden="0" w:uiPriority="69" w:unhideWhenUsed="0"/>
+    <w:lsdException w:name="Dark List Accent 1" w:semiHidden="0" w:uiPriority="70" w:unhideWhenUsed="0"/>
+    <w:lsdException w:name="Colorful Shading Accent 1" w:semiHidden="0" w:uiPriority="71" w:unhideWhenUsed="0"/>
+    <w:lsdException w:name="Colorful List Accent 1" w:semiHidden="0" w:uiPriority="72" w:unhideWhenUsed="0"/>
+    <w:lsdException w:name="Colorful Grid Accent 1" w:semiHidden="0" w:uiPriority="73" w:unhideWhenUsed="0"/>
+    <w:lsdException w:name="Light Shading Accent 2" w:semiHidden="0" w:uiPriority="60" w:unhideWhenUsed="0"/>
+    <w:lsdException w:name="Light List Accent 2" w:semiHidden="0" w:uiPriority="61" w:unhideWhenUsed="0"/>
+    <w:lsdException w:name="Light Grid Accent 2" w:semiHidden="0" w:uiPriority="62" w:unhideWhenUsed="0"/>
+    <w:lsdException w:name="Medium Shading 1 Accent 2" w:semiHidden="0" w:uiPriority="63" w:unhideWhenUsed="0"/>
+    <w:lsdException w:name="Medium Shading 2 Accent 2" w:semiHidden="0" w:uiPriority="64" w:unhideWhenUsed="0"/>
+    <w:lsdException w:name="Medium List 1 Accent 2" w:semiHidden="0" w:uiPriority="65" w:unhideWhenUsed="0"/>
+    <w:lsdException w:name="Medium List 2 Accent 2" w:semiHidden="0" w:uiPriority="66" w:unhideWhenUsed="0"/>
+    <w:lsdException w:name="Medium Grid 1 Accent 2" w:semiHidden="0" w:uiPriority="67" w:unhideWhenUsed="0"/>
+    <w:lsdException w:name="Medium Grid 2 Accent 2" w:semiHidden="0" w:uiPriority="68" w:unhideWhenUsed="0"/>
+    <w:lsdException w:name="Medium Grid 3 Accent 2" w:semiHidden="0" w:uiPriority="69" w:unhideWhenUsed="0"/>
+    <w:lsdException w:name="Dark List Accent 2" w:semiHidden="0" w:uiPriority="70" w:unhideWhenUsed="0"/>
+    <w:lsdException w:name="Colorful Shading Accent 2" w:semiHidden="0" w:uiPriority="71" w:unhideWhenUsed="0"/>
+    <w:lsdException w:name="Colorful List Accent 2" w:semiHidden="0" w:uiPriority="72" w:unhideWhenUsed="0"/>
+    <w:lsdException w:name="Colorful Grid Accent 2" w:semiHidden="0" w:uiPriority="73" w:unhideWhenUsed="0"/>
+    <w:lsdException w:name="Light Shading Accent 3" w:semiHidden="0" w:uiPriority="60" w:unhideWhenUsed="0"/>
+    <w:lsdException w:name="Light List Accent 3" w:semiHidden="0" w:uiPriority="61" w:unhideWhenUsed="0"/>
+    <w:lsdException w:name="Light Grid Accent 3" w:semiHidden="0" w:uiPriority="62" w:unhideWhenUsed="0"/>
+    <w:lsdException w:name="Medium Shading 1 Accent 3" w:semiHidden="0" w:uiPriority="63" w:unhideWhenUsed="0"/>
+    <w:lsdException w:name="Medium Shading 2 Accent 3" w:semiHidden="0" w:uiPriority="64" w:unhideWhenUsed="0"/>
+    <w:lsdException w:name="Medium List 1 Accent 3" w:semiHidden="0" w:uiPriority="65" w:unhideWhenUsed="0"/>
+    <w:lsdException w:name="Medium List 2 Accent 3" w:semiHidden="0" w:uiPriority="66" w:unhideWhenUsed="0"/>
+    <w:lsdException w:name="Medium Grid 1 Accent 3" w:semiHidden="0" w:uiPriority="67" w:unhideWhenUsed="0"/>
+    <w:lsdException w:name="Medium Grid 2 Accent 3" w:semiHidden="0" w:uiPriority="68" w:unhideWhenUsed="0"/>
+    <w:lsdException w:name="Medium Grid 3 Accent 3" w:semiHidden="0" w:uiPriority="69" w:unhideWhenUsed="0"/>
+    <w:lsdException w:name="Dark List Accent 3" w:semiHidden="0" w:uiPriority="70" w:unhideWhenUsed="0"/>
+    <w:lsdException w:name="Colorful Shading Accent 3" w:semiHidden="0" w:uiPriority="71" w:unhideWhenUsed="0"/>
+    <w:lsdException w:name="Colorful List Accent 3" w:semiHidden="0" w:uiPriority="72" w:unhideWhenUsed="0"/>
+    <w:lsdException w:name="Colorful Grid Accent 3" w:semiHidden="0" w:uiPriority="73" w:unhideWhenUsed="0"/>
+    <w:lsdException w:name="Light Shading Accent 4" w:semiHidden="0" w:uiPriority="60" w:unhideWhenUsed="0"/>
+    <w:lsdException w:name="Light List Accent 4" w:semiHidden="0" w:uiPriority="61" w:unhideWhenUsed="0"/>
+    <w:lsdException w:name="Light Grid Accent 4" w:semiHidden="0" w:uiPriority="62" w:unhideWhenUsed="0"/>
+    <w:lsdException w:name="Medium Shading 1 Accent 4" w:semiHidden="0" w:uiPriority="63" w:unhideWhenUsed="0"/>
+    <w:lsdException w:name="Medium Shading 2 Accent 4" w:semiHidden="0" w:uiPriority="64" w:unhideWhenUsed="0"/>
+    <w:lsdException w:name="Medium List 1 Accent 4" w:semiHidden="0" w:uiPriority="65" w:unhideWhenUsed="0"/>
+    <w:lsdException w:name="Medium List 2 Accent 4" w:semiHidden="0" w:uiPriority="66" w:unhideWhenUsed="0"/>
+    <w:lsdException w:name="Medium Grid 1 Accent 4" w:semiHidden="0" w:uiPriority="67" w:unhideWhenUsed="0"/>
+    <w:lsdException w:name="Medium Grid 2 Accent 4" w:semiHidden="0" w:uiPriority="68" w:unhideWhenUsed="0"/>
+    <w:lsdException w:name="Medium Grid 3 Accent 4" w:semiHidden="0" w:uiPriority="69" w:unhideWhenUsed="0"/>
+    <w:lsdException w:name="Dark List Accent 4" w:semiHidden="0" w:uiPriority="70" w:unhideWhenUsed="0"/>
+    <w:lsdException w:name="Colorful Shading Accent 4" w:semiHidden="0" w:uiPriority="71" w:unhideWhenUsed="0"/>
+    <w:lsdException w:name="Colorful List Accent 4" w:semiHidden="0" w:uiPriority="72" w:unhideWhenUsed="0"/>
+    <w:lsdException w:name="Colorful Grid Accent 4" w:semiHidden="0" w:uiPriority="73" w:unhideWhenUsed="0"/>
+    <w:lsdException w:name="Light Shading Accent 5" w:semiHidden="0" w:uiPriority="60" w:unhideWhenUsed="0"/>
+    <w:lsdException w:name="Light List Accent 5" w:semiHidden="0" w:uiPriority="61" w:unhideWhenUsed="0"/>
+    <w:lsdException w:name="Light Grid Accent 5" w:semiHidden="0" w:uiPriority="62" w:unhideWhenUsed="0"/>
+    <w:lsdException w:name="Medium Shading 1 Accent 5" w:semiHidden="0" w:uiPriority="63" w:unhideWhenUsed="0"/>
+    <w:lsdException w:name="Medium Shading 2 Accent 5" w:semiHidden="0" w:uiPriority="64" w:unhideWhenUsed="0"/>
+    <w:lsdException w:name="Medium List 1 Accent 5" w:semiHidden="0" w:uiPriority="65" w:unhideWhenUsed="0"/>
+    <w:lsdException w:name="Medium List 2 Accent 5" w:semiHidden="0" w:uiPriority="66" w:unhideWhenUsed="0"/>
+    <w:lsdException w:name="Medium Grid 1 Accent 5" w:semiHidden="0" w:uiPriority="67" w:unhideWhenUsed="0"/>
+    <w:lsdException w:name="Medium Grid 2 Accent 5" w:semiHidden="0" w:uiPriority="68" w:unhideWhenUsed="0"/>
+    <w:lsdException w:name="Medium Grid 3 Accent 5" w:semiHidden="0" w:uiPriority="69" w:unhideWhenUsed="0"/>
+    <w:lsdException w:name="Dark List Accent 5" w:semiHidden="0" w:uiPriority="70" w:unhideWhenUsed="0"/>
+    <w:lsdException w:name="Colorful Shading Accent 5" w:semiHidden="0" w:uiPriority="71" w:unhideWhenUsed="0"/>
+    <w:lsdException w:name="Colorful List Accent 5" w:semiHidden="0" w:uiPriority="72" w:unhideWhenUsed="0"/>
+    <w:lsdException w:name="Colorful Grid Accent 5" w:semiHidden="0" w:uiPriority="73" w:unhideWhenUsed="0"/>
+    <w:lsdException w:name="Light Shading Accent 6" w:semiHidden="0" w:uiPriority="60" w:unhideWhenUsed="0"/>
+    <w:lsdException w:name="Light List Accent 6" w:semiHidden="0" w:uiPriority="61" w:unhideWhenUsed="0"/>
+    <w:lsdException w:name="Light Grid Accent 6" w:semiHidden="0" w:uiPriority="62" w:unhideWhenUsed="0"/>
+    <w:lsdException w:name="Medium Shading 1 Accent 6" w:semiHidden="0" w:uiPriority="63" w:unhideWhenUsed="0"/>
+    <w:lsdException w:name="Medium Shading 2 Accent 6" w:semiHidden="0" w:uiPriority="64" w:unhideWhenUsed="0"/>
+    <w:lsdException w:name="Medium List 1 Accent 6" w:semiHidden="0" w:uiPriority="65" w:unhideWhenUsed="0"/>
+    <w:lsdException w:name="Medium List 2 Accent 6" w:semiHidden="0" w:uiPriority="66" w:unhideWhenUsed="0"/>
+    <w:lsdException w:name="Medium Grid 1 Accent 6" w:semiHidden="0" w:uiPriority="67" w:unhideWhenUsed="0"/>
+    <w:lsdException w:name="Medium Grid 2 Accent 6" w:semiHidden="0" w:uiPriority="68" w:unhideWhenUsed="0"/>
+    <w:lsdException w:name="Medium Grid 3 Accent 6" w:semiHidden="0" w:uiPriority="69" w:unhideWhenUsed="0"/>
+    <w:lsdException w:name="Dark List Accent 6" w:semiHidden="0" w:uiPriority="70" w:unhideWhenUsed="0"/>
+    <w:lsdException w:name="Colorful Shading Accent 6" w:semiHidden="0" w:uiPriority="71" w:unhideWhenUsed="0"/>
+    <w:lsdException w:name="Colorful List Accent 6" w:semiHidden="0" w:uiPriority="72" w:unhideWhenUsed="0"/>
+    <w:lsdException w:name="Colorful Grid Accent 6" w:semiHidden="0" w:uiPriority="73" w:unhideWhenUsed="0"/>
+    <w:lsdException w:name="Subtle Emphasis" w:semiHidden="0" w:uiPriority="19" w:unhideWhenUsed="0" w:qFormat="1"/>
+    <w:lsdException w:name="Intense Emphasis" w:semiHidden="0" w:uiPriority="21" w:unhideWhenUsed="0" w:qFormat="1"/>
+    <w:lsdException w:name="Subtle Reference" w:semiHidden="0" w:uiPriority="31" w:unhideWhenUsed="0" w:qFormat="1"/>
+    <w:lsdException w:name="Intense Reference" w:semiHidden="0" w:uiPriority="32" w:unhideWhenUsed="0" w:qFormat="1"/>
+    <w:lsdException w:name="Book Title" w:semiHidden="0" w:uiPriority="33" w:unhideWhenUsed="0" w:qFormat="1"/>
+    <w:lsdException w:name="Bibliography" w:uiPriority="37"/>
+    <w:lsdException w:name="TOC Heading" w:uiPriority="39" w:qFormat="1"/>
   </w:latentStyles>
   <w:style w:type="paragraph" w:default="1" w:styleId="Normal">
     <w:name w:val="Normal"/>
     <w:qFormat/>
+    <w:rsid w:val="00D12243"/>
   </w:style>
   <w:style w:type="paragraph" w:styleId="Heading1">
     <w:name w:val="heading 1"/>
@@ -7478,6 +7305,7 @@
     <w:next w:val="Normal"/>
     <w:uiPriority w:val="9"/>
     <w:qFormat/>
+    <w:rsid w:val="00D12243"/>
     <w:pPr>
       <w:keepNext/>
       <w:keepLines/>
@@ -7496,6 +7324,7 @@
     <w:uiPriority w:val="9"/>
     <w:unhideWhenUsed/>
     <w:qFormat/>
+    <w:rsid w:val="00D12243"/>
     <w:pPr>
       <w:keepNext/>
       <w:keepLines/>
@@ -7514,6 +7343,7 @@
     <w:uiPriority w:val="9"/>
     <w:unhideWhenUsed/>
     <w:qFormat/>
+    <w:rsid w:val="00D12243"/>
     <w:pPr>
       <w:keepNext/>
       <w:keepLines/>
@@ -7534,6 +7364,7 @@
     <w:semiHidden/>
     <w:unhideWhenUsed/>
     <w:qFormat/>
+    <w:rsid w:val="00D12243"/>
     <w:pPr>
       <w:keepNext/>
       <w:keepLines/>
@@ -7554,6 +7385,7 @@
     <w:semiHidden/>
     <w:unhideWhenUsed/>
     <w:qFormat/>
+    <w:rsid w:val="00D12243"/>
     <w:pPr>
       <w:keepNext/>
       <w:keepLines/>
@@ -7572,6 +7404,7 @@
     <w:semiHidden/>
     <w:unhideWhenUsed/>
     <w:qFormat/>
+    <w:rsid w:val="00D12243"/>
     <w:pPr>
       <w:keepNext/>
       <w:keepLines/>
@@ -7595,6 +7428,7 @@
     <w:uiPriority w:val="99"/>
     <w:semiHidden/>
     <w:unhideWhenUsed/>
+    <w:qFormat/>
     <w:tblPr>
       <w:tblInd w:w="0" w:type="dxa"/>
       <w:tblCellMar>
@@ -7613,6 +7447,7 @@
   </w:style>
   <w:style w:type="table" w:customStyle="1" w:styleId="TableNormal0">
     <w:name w:val="TableNormal"/>
+    <w:rsid w:val="00D12243"/>
     <w:tblPr>
       <w:tblCellMar>
         <w:top w:w="100" w:type="dxa"/>
@@ -7628,6 +7463,7 @@
     <w:next w:val="Normal"/>
     <w:uiPriority w:val="10"/>
     <w:qFormat/>
+    <w:rsid w:val="00D12243"/>
     <w:pPr>
       <w:keepNext/>
       <w:keepLines/>
@@ -7644,6 +7480,7 @@
     <w:next w:val="Normal"/>
     <w:uiPriority w:val="11"/>
     <w:qFormat/>
+    <w:rsid w:val="00D12243"/>
     <w:pPr>
       <w:keepNext/>
       <w:keepLines/>

</xml_diff>